<commit_message>
preenchimento das pre condicoes e do resumo
</commit_message>
<xml_diff>
--- a/Sleep_street.docx
+++ b/Sleep_street.docx
@@ -2,6 +2,36 @@
 <file path=word/document.xml><?xml version="1.0" encoding="utf-8"?>
 <w:document xmlns:mc="http://schemas.openxmlformats.org/markup-compatibility/2006" xmlns:o="urn:schemas-microsoft-com:office:office" xmlns:r="http://schemas.openxmlformats.org/officeDocument/2006/relationships" xmlns:m="http://schemas.openxmlformats.org/officeDocument/2006/math" xmlns:v="urn:schemas-microsoft-com:vml" xmlns:wp="http://schemas.openxmlformats.org/drawingml/2006/wordprocessingDrawing" xmlns:w10="urn:schemas-microsoft-com:office:word" xmlns:w="http://schemas.openxmlformats.org/wordprocessingml/2006/main" xmlns:wne="http://schemas.microsoft.com/office/word/2006/wordml" xmlns:sl="http://schemas.openxmlformats.org/schemaLibrary/2006/main" xmlns:a="http://schemas.openxmlformats.org/drawingml/2006/main" xmlns:pic="http://schemas.openxmlformats.org/drawingml/2006/picture" xmlns:c="http://schemas.openxmlformats.org/drawingml/2006/chart" xmlns:lc="http://schemas.openxmlformats.org/drawingml/2006/lockedCanvas" xmlns:dgm="http://schemas.openxmlformats.org/drawingml/2006/diagram" xmlns:wps="http://schemas.microsoft.com/office/word/2010/wordprocessingShape" xmlns:wpg="http://schemas.microsoft.com/office/word/2010/wordprocessingGroup" xmlns:w14="http://schemas.microsoft.com/office/word/2010/wordml" xmlns:w15="http://schemas.microsoft.com/office/word/2012/wordml" xmlns:w16="http://schemas.microsoft.com/office/word/2018/wordml" xmlns:w16cex="http://schemas.microsoft.com/office/word/2018/wordml/cex" xmlns:w16cid="http://schemas.microsoft.com/office/word/2016/wordml/cid" xmlns="http://schemas.microsoft.com/office/tasks/2019/documenttasks" xmlns:cr="http://schemas.microsoft.com/office/comments/2020/reactions">
   <w:body>
+    <w:p>
+      <w:pPr>
+        <w:keepNext w:val="0"/>
+        <w:keepLines w:val="0"/>
+        <w:pageBreakBefore w:val="0"/>
+        <w:widowControl w:val="0"/>
+        <w:pBdr>
+          <w:top w:space="0" w:sz="0" w:val="nil"/>
+          <w:left w:space="0" w:sz="0" w:val="nil"/>
+          <w:bottom w:space="0" w:sz="0" w:val="nil"/>
+          <w:right w:space="0" w:sz="0" w:val="nil"/>
+          <w:between w:space="0" w:sz="0" w:val="nil"/>
+        </w:pBdr>
+        <w:shd w:fill="auto" w:val="clear"/>
+        <w:spacing w:after="0" w:before="0" w:line="240" w:lineRule="auto"/>
+        <w:ind w:left="0" w:right="0" w:firstLine="0"/>
+        <w:jc w:val="left"/>
+        <w:rPr>
+          <w:b w:val="1"/>
+          <w:bCs w:val="1"/>
+          <w:sz w:val="24"/>
+          <w:szCs w:val="24"/>
+        </w:rPr>
+      </w:pPr>
+      <w:r>
+        <w:rPr>
+          <w:rtl w:val="0"/>
+        </w:rPr>
+      </w:r>
+    </w:p>
     <w:p>
       <w:pPr>
         <w:keepNext w:val="0"/>
@@ -518,61 +548,22 @@
       </w:pPr>
       <w:r>
         <w:rPr>
+          <w:rFonts w:ascii="Arial" w:cs="Arial" w:eastAsia="Arial" w:hAnsi="Arial"/>
           <w:b w:val="1"/>
           <w:bCs w:val="1"/>
-          <w:sz w:val="24"/>
-          <w:szCs w:val="24"/>
-          <w:rtl w:val="0"/>
-        </w:rPr>
-        <w:t xml:space="preserve">Daniel</w:t>
-      </w:r>
-      <w:r>
-        <w:rPr>
-          <w:rFonts w:ascii="Arial" w:cs="Arial" w:eastAsia="Arial" w:hAnsi="Arial"/>
-          <w:b w:val="1"/>
-          <w:bCs w:val="1"/>
-          <w:i w:val="0"/>
-          <w:iCs w:val="0"/>
-          <w:smallCaps w:val="0"/>
-          <w:strike w:val="0"/>
-          <w:color w:val="000000"/>
-          <w:sz w:val="24"/>
-          <w:szCs w:val="24"/>
-          <w:u w:val="none"/>
-          <w:shd w:fill="auto" w:val="clear"/>
-          <w:vertAlign w:val="baseline"/>
-          <w:rtl w:val="0"/>
-        </w:rPr>
-        <w:t xml:space="preserve"> Moreira - Analista de Requisitos / </w:t>
-      </w:r>
-      <w:r>
-        <w:rPr>
-          <w:b w:val="1"/>
-          <w:bCs w:val="1"/>
-          <w:sz w:val="24"/>
-          <w:szCs w:val="24"/>
-          <w:rtl w:val="0"/>
-        </w:rPr>
-        <w:t xml:space="preserve">POR Gabriel</w:t>
-      </w:r>
-      <w:r>
-        <w:rPr>
-          <w:rFonts w:ascii="Arial" w:cs="Arial" w:eastAsia="Arial" w:hAnsi="Arial"/>
-          <w:b w:val="1"/>
-          <w:bCs w:val="1"/>
-          <w:i w:val="0"/>
-          <w:iCs w:val="0"/>
-          <w:smallCaps w:val="0"/>
-          <w:strike w:val="0"/>
-          <w:color w:val="000000"/>
-          <w:sz w:val="24"/>
-          <w:szCs w:val="24"/>
-          <w:u w:val="none"/>
-          <w:shd w:fill="auto" w:val="clear"/>
-          <w:vertAlign w:val="baseline"/>
-          <w:rtl w:val="0"/>
-        </w:rPr>
-        <w:t xml:space="preserve"> Henrique de Lima Ferreira - Backend Developer / QA </w:t>
+          <w:i w:val="0"/>
+          <w:iCs w:val="0"/>
+          <w:smallCaps w:val="0"/>
+          <w:strike w:val="0"/>
+          <w:color w:val="000000"/>
+          <w:sz w:val="24"/>
+          <w:szCs w:val="24"/>
+          <w:u w:val="none"/>
+          <w:shd w:fill="auto" w:val="clear"/>
+          <w:vertAlign w:val="baseline"/>
+          <w:rtl w:val="0"/>
+        </w:rPr>
+        <w:t xml:space="preserve">Dhaniel Moreira - Analista de Requisitos / PO Gabriel Henrique de Lima Ferreira - Backend Developer / QA </w:t>
       </w:r>
     </w:p>
     <w:p>
@@ -4152,6 +4143,7 @@
             <w:pPr>
               <w:keepNext w:val="0"/>
               <w:keepLines w:val="0"/>
+              <w:pageBreakBefore w:val="0"/>
               <w:widowControl w:val="0"/>
               <w:pBdr>
                 <w:top w:space="0" w:sz="0" w:val="nil"/>
@@ -4216,6 +4208,7 @@
             <w:pPr>
               <w:keepNext w:val="0"/>
               <w:keepLines w:val="0"/>
+              <w:pageBreakBefore w:val="0"/>
               <w:widowControl w:val="0"/>
               <w:pBdr>
                 <w:top w:space="0" w:sz="0" w:val="nil"/>
@@ -4280,6 +4273,7 @@
             <w:pPr>
               <w:keepNext w:val="0"/>
               <w:keepLines w:val="0"/>
+              <w:pageBreakBefore w:val="0"/>
               <w:widowControl w:val="0"/>
               <w:pBdr>
                 <w:top w:space="0" w:sz="0" w:val="nil"/>
@@ -4352,6 +4346,7 @@
             <w:pPr>
               <w:keepNext w:val="0"/>
               <w:keepLines w:val="0"/>
+              <w:pageBreakBefore w:val="0"/>
               <w:widowControl w:val="0"/>
               <w:pBdr>
                 <w:top w:space="0" w:sz="0" w:val="nil"/>
@@ -4424,6 +4419,7 @@
             <w:pPr>
               <w:keepNext w:val="0"/>
               <w:keepLines w:val="0"/>
+              <w:pageBreakBefore w:val="0"/>
               <w:widowControl w:val="0"/>
               <w:pBdr>
                 <w:top w:space="0" w:sz="0" w:val="nil"/>
@@ -4495,6 +4491,7 @@
             <w:pPr>
               <w:keepNext w:val="0"/>
               <w:keepLines w:val="0"/>
+              <w:pageBreakBefore w:val="0"/>
               <w:widowControl w:val="0"/>
               <w:pBdr>
                 <w:top w:space="0" w:sz="0" w:val="nil"/>
@@ -4559,6 +4556,7 @@
             <w:pPr>
               <w:keepNext w:val="0"/>
               <w:keepLines w:val="0"/>
+              <w:pageBreakBefore w:val="0"/>
               <w:widowControl w:val="0"/>
               <w:pBdr>
                 <w:top w:space="0" w:sz="0" w:val="nil"/>
@@ -4623,6 +4621,7 @@
             <w:pPr>
               <w:keepNext w:val="0"/>
               <w:keepLines w:val="0"/>
+              <w:pageBreakBefore w:val="0"/>
               <w:widowControl w:val="0"/>
               <w:pBdr>
                 <w:top w:space="0" w:sz="0" w:val="nil"/>
@@ -4687,6 +4686,7 @@
             <w:pPr>
               <w:keepNext w:val="0"/>
               <w:keepLines w:val="0"/>
+              <w:pageBreakBefore w:val="0"/>
               <w:widowControl w:val="0"/>
               <w:pBdr>
                 <w:top w:space="0" w:sz="0" w:val="nil"/>
@@ -4751,6 +4751,7 @@
             <w:pPr>
               <w:keepNext w:val="0"/>
               <w:keepLines w:val="0"/>
+              <w:pageBreakBefore w:val="0"/>
               <w:widowControl w:val="0"/>
               <w:pBdr>
                 <w:top w:space="0" w:sz="0" w:val="nil"/>
@@ -4822,6 +4823,7 @@
             <w:pPr>
               <w:keepNext w:val="0"/>
               <w:keepLines w:val="0"/>
+              <w:pageBreakBefore w:val="0"/>
               <w:widowControl w:val="0"/>
               <w:pBdr>
                 <w:top w:space="0" w:sz="0" w:val="nil"/>
@@ -4874,6 +4876,7 @@
             <w:pPr>
               <w:keepNext w:val="0"/>
               <w:keepLines w:val="0"/>
+              <w:pageBreakBefore w:val="0"/>
               <w:widowControl w:val="0"/>
               <w:pBdr>
                 <w:top w:space="0" w:sz="0" w:val="nil"/>
@@ -4938,6 +4941,7 @@
             <w:pPr>
               <w:keepNext w:val="0"/>
               <w:keepLines w:val="0"/>
+              <w:pageBreakBefore w:val="0"/>
               <w:widowControl w:val="0"/>
               <w:pBdr>
                 <w:top w:space="0" w:sz="0" w:val="nil"/>
@@ -4988,6 +4992,7 @@
             <w:pPr>
               <w:keepNext w:val="0"/>
               <w:keepLines w:val="0"/>
+              <w:pageBreakBefore w:val="0"/>
               <w:widowControl w:val="0"/>
               <w:pBdr>
                 <w:top w:space="0" w:sz="0" w:val="nil"/>
@@ -5052,6 +5057,7 @@
             <w:pPr>
               <w:keepNext w:val="0"/>
               <w:keepLines w:val="0"/>
+              <w:pageBreakBefore w:val="0"/>
               <w:widowControl w:val="0"/>
               <w:pBdr>
                 <w:top w:space="0" w:sz="0" w:val="nil"/>
@@ -5116,6 +5122,7 @@
             <w:pPr>
               <w:keepNext w:val="0"/>
               <w:keepLines w:val="0"/>
+              <w:pageBreakBefore w:val="0"/>
               <w:widowControl w:val="0"/>
               <w:pBdr>
                 <w:top w:space="0" w:sz="0" w:val="nil"/>
@@ -5187,6 +5194,7 @@
             <w:pPr>
               <w:keepNext w:val="0"/>
               <w:keepLines w:val="0"/>
+              <w:pageBreakBefore w:val="0"/>
               <w:widowControl w:val="0"/>
               <w:pBdr>
                 <w:top w:space="0" w:sz="0" w:val="nil"/>
@@ -5239,6 +5247,7 @@
             <w:pPr>
               <w:keepNext w:val="0"/>
               <w:keepLines w:val="0"/>
+              <w:pageBreakBefore w:val="0"/>
               <w:widowControl w:val="0"/>
               <w:pBdr>
                 <w:top w:space="0" w:sz="0" w:val="nil"/>
@@ -5303,6 +5312,7 @@
             <w:pPr>
               <w:keepNext w:val="0"/>
               <w:keepLines w:val="0"/>
+              <w:pageBreakBefore w:val="0"/>
               <w:widowControl w:val="0"/>
               <w:pBdr>
                 <w:top w:space="0" w:sz="0" w:val="nil"/>
@@ -5353,6 +5363,7 @@
             <w:pPr>
               <w:keepNext w:val="0"/>
               <w:keepLines w:val="0"/>
+              <w:pageBreakBefore w:val="0"/>
               <w:widowControl w:val="0"/>
               <w:pBdr>
                 <w:top w:space="0" w:sz="0" w:val="nil"/>
@@ -5403,6 +5414,7 @@
             <w:pPr>
               <w:keepNext w:val="0"/>
               <w:keepLines w:val="0"/>
+              <w:pageBreakBefore w:val="0"/>
               <w:widowControl w:val="0"/>
               <w:pBdr>
                 <w:top w:space="0" w:sz="0" w:val="nil"/>
@@ -5453,6 +5465,7 @@
             <w:pPr>
               <w:keepNext w:val="0"/>
               <w:keepLines w:val="0"/>
+              <w:pageBreakBefore w:val="0"/>
               <w:widowControl w:val="0"/>
               <w:pBdr>
                 <w:top w:space="0" w:sz="0" w:val="nil"/>
@@ -5510,6 +5523,7 @@
             <w:pPr>
               <w:keepNext w:val="0"/>
               <w:keepLines w:val="0"/>
+              <w:pageBreakBefore w:val="0"/>
               <w:widowControl w:val="0"/>
               <w:pBdr>
                 <w:top w:space="0" w:sz="0" w:val="nil"/>
@@ -5574,6 +5588,7 @@
             <w:pPr>
               <w:keepNext w:val="0"/>
               <w:keepLines w:val="0"/>
+              <w:pageBreakBefore w:val="0"/>
               <w:widowControl w:val="0"/>
               <w:pBdr>
                 <w:top w:space="0" w:sz="0" w:val="nil"/>
@@ -5624,6 +5639,7 @@
             <w:pPr>
               <w:keepNext w:val="0"/>
               <w:keepLines w:val="0"/>
+              <w:pageBreakBefore w:val="0"/>
               <w:widowControl w:val="0"/>
               <w:pBdr>
                 <w:top w:space="0" w:sz="0" w:val="nil"/>
@@ -5674,6 +5690,7 @@
             <w:pPr>
               <w:keepNext w:val="0"/>
               <w:keepLines w:val="0"/>
+              <w:pageBreakBefore w:val="0"/>
               <w:widowControl w:val="0"/>
               <w:pBdr>
                 <w:top w:space="0" w:sz="0" w:val="nil"/>
@@ -5724,6 +5741,7 @@
             <w:pPr>
               <w:keepNext w:val="0"/>
               <w:keepLines w:val="0"/>
+              <w:pageBreakBefore w:val="0"/>
               <w:widowControl w:val="0"/>
               <w:pBdr>
                 <w:top w:space="0" w:sz="0" w:val="nil"/>
@@ -5892,6 +5910,7 @@
             <w:pPr>
               <w:keepNext w:val="0"/>
               <w:keepLines w:val="0"/>
+              <w:pageBreakBefore w:val="0"/>
               <w:widowControl w:val="0"/>
               <w:pBdr>
                 <w:top w:space="0" w:sz="0" w:val="nil"/>
@@ -5956,6 +5975,7 @@
             <w:pPr>
               <w:keepNext w:val="0"/>
               <w:keepLines w:val="0"/>
+              <w:pageBreakBefore w:val="0"/>
               <w:widowControl w:val="0"/>
               <w:pBdr>
                 <w:top w:space="0" w:sz="0" w:val="nil"/>
@@ -6006,6 +6026,7 @@
             <w:pPr>
               <w:keepNext w:val="0"/>
               <w:keepLines w:val="0"/>
+              <w:pageBreakBefore w:val="0"/>
               <w:widowControl w:val="0"/>
               <w:pBdr>
                 <w:top w:space="0" w:sz="0" w:val="nil"/>
@@ -6056,6 +6077,7 @@
             <w:pPr>
               <w:keepNext w:val="0"/>
               <w:keepLines w:val="0"/>
+              <w:pageBreakBefore w:val="0"/>
               <w:widowControl w:val="0"/>
               <w:pBdr>
                 <w:top w:space="0" w:sz="0" w:val="nil"/>
@@ -6106,6 +6128,7 @@
             <w:pPr>
               <w:keepNext w:val="0"/>
               <w:keepLines w:val="0"/>
+              <w:pageBreakBefore w:val="0"/>
               <w:widowControl w:val="0"/>
               <w:pBdr>
                 <w:top w:space="0" w:sz="0" w:val="nil"/>
@@ -6275,6 +6298,7 @@
             <w:pPr>
               <w:keepNext w:val="0"/>
               <w:keepLines w:val="0"/>
+              <w:pageBreakBefore w:val="0"/>
               <w:widowControl w:val="0"/>
               <w:pBdr>
                 <w:top w:space="0" w:sz="0" w:val="nil"/>
@@ -6339,6 +6363,7 @@
             <w:pPr>
               <w:keepNext w:val="0"/>
               <w:keepLines w:val="0"/>
+              <w:pageBreakBefore w:val="0"/>
               <w:widowControl w:val="0"/>
               <w:pBdr>
                 <w:top w:space="0" w:sz="0" w:val="nil"/>
@@ -6403,6 +6428,7 @@
             <w:pPr>
               <w:keepNext w:val="0"/>
               <w:keepLines w:val="0"/>
+              <w:pageBreakBefore w:val="0"/>
               <w:widowControl w:val="0"/>
               <w:pBdr>
                 <w:top w:space="0" w:sz="0" w:val="nil"/>
@@ -6475,6 +6501,7 @@
             <w:pPr>
               <w:keepNext w:val="0"/>
               <w:keepLines w:val="0"/>
+              <w:pageBreakBefore w:val="0"/>
               <w:widowControl w:val="0"/>
               <w:pBdr>
                 <w:top w:space="0" w:sz="0" w:val="nil"/>
@@ -6547,6 +6574,7 @@
             <w:pPr>
               <w:keepNext w:val="0"/>
               <w:keepLines w:val="0"/>
+              <w:pageBreakBefore w:val="0"/>
               <w:widowControl w:val="0"/>
               <w:pBdr>
                 <w:top w:space="0" w:sz="0" w:val="nil"/>
@@ -6618,6 +6646,7 @@
             <w:pPr>
               <w:keepNext w:val="0"/>
               <w:keepLines w:val="0"/>
+              <w:pageBreakBefore w:val="0"/>
               <w:widowControl w:val="0"/>
               <w:pBdr>
                 <w:top w:space="0" w:sz="0" w:val="nil"/>
@@ -6682,6 +6711,7 @@
             <w:pPr>
               <w:keepNext w:val="0"/>
               <w:keepLines w:val="0"/>
+              <w:pageBreakBefore w:val="0"/>
               <w:widowControl w:val="0"/>
               <w:pBdr>
                 <w:top w:space="0" w:sz="0" w:val="nil"/>
@@ -6746,6 +6776,7 @@
             <w:pPr>
               <w:keepNext w:val="0"/>
               <w:keepLines w:val="0"/>
+              <w:pageBreakBefore w:val="0"/>
               <w:widowControl w:val="0"/>
               <w:pBdr>
                 <w:top w:space="0" w:sz="0" w:val="nil"/>
@@ -6810,6 +6841,7 @@
             <w:pPr>
               <w:keepNext w:val="0"/>
               <w:keepLines w:val="0"/>
+              <w:pageBreakBefore w:val="0"/>
               <w:widowControl w:val="0"/>
               <w:pBdr>
                 <w:top w:space="0" w:sz="0" w:val="nil"/>
@@ -6874,6 +6906,7 @@
             <w:pPr>
               <w:keepNext w:val="0"/>
               <w:keepLines w:val="0"/>
+              <w:pageBreakBefore w:val="0"/>
               <w:widowControl w:val="0"/>
               <w:pBdr>
                 <w:top w:space="0" w:sz="0" w:val="nil"/>
@@ -6920,437 +6953,6 @@
                 <w:rtl w:val="0"/>
               </w:rPr>
               <w:t xml:space="preserve">Estável</w:t>
-            </w:r>
-          </w:p>
-        </w:tc>
-      </w:tr>
-      <w:tr>
-        <w:trPr>
-          <w:cantSplit w:val="0"/>
-          <w:trHeight w:val="1515" w:hRule="atLeast"/>
-          <w:tblHeader w:val="0"/>
-        </w:trPr>
-        <w:tc>
-          <w:tcPr>
-            <w:shd w:fill="auto" w:val="clear"/>
-            <w:tcMar>
-              <w:top w:w="100.0" w:type="dxa"/>
-              <w:left w:w="100.0" w:type="dxa"/>
-              <w:bottom w:w="100.0" w:type="dxa"/>
-              <w:right w:w="100.0" w:type="dxa"/>
-            </w:tcMar>
-            <w:vAlign w:val="top"/>
-          </w:tcPr>
-          <w:p>
-            <w:pPr>
-              <w:keepNext w:val="0"/>
-              <w:keepLines w:val="0"/>
-              <w:widowControl w:val="0"/>
-              <w:pBdr>
-                <w:top w:space="0" w:sz="0" w:val="nil"/>
-                <w:left w:space="0" w:sz="0" w:val="nil"/>
-                <w:bottom w:space="0" w:sz="0" w:val="nil"/>
-                <w:right w:space="0" w:sz="0" w:val="nil"/>
-                <w:between w:space="0" w:sz="0" w:val="nil"/>
-              </w:pBdr>
-              <w:shd w:fill="auto" w:val="clear"/>
-              <w:spacing w:after="0" w:before="0" w:line="229.88847255706787" w:lineRule="auto"/>
-              <w:ind w:left="124.42733764648438" w:right="52.001953125" w:firstLine="8.8800048828125"/>
-              <w:jc w:val="both"/>
-              <w:rPr>
-                <w:rFonts w:ascii="Arial" w:cs="Arial" w:eastAsia="Arial" w:hAnsi="Arial"/>
-                <w:b w:val="1"/>
-                <w:bCs w:val="1"/>
-                <w:i w:val="0"/>
-                <w:iCs w:val="0"/>
-                <w:smallCaps w:val="0"/>
-                <w:strike w:val="0"/>
-                <w:color w:val="000000"/>
-                <w:sz w:val="24"/>
-                <w:szCs w:val="24"/>
-                <w:u w:val="none"/>
-                <w:shd w:fill="auto" w:val="clear"/>
-                <w:vertAlign w:val="baseline"/>
-              </w:rPr>
-            </w:pPr>
-            <w:r>
-              <w:rPr>
-                <w:rFonts w:ascii="Arial" w:cs="Arial" w:eastAsia="Arial" w:hAnsi="Arial"/>
-                <w:b w:val="1"/>
-                <w:bCs w:val="1"/>
-                <w:i w:val="0"/>
-                <w:iCs w:val="0"/>
-                <w:smallCaps w:val="0"/>
-                <w:strike w:val="0"/>
-                <w:color w:val="000000"/>
-                <w:sz w:val="24"/>
-                <w:szCs w:val="24"/>
-                <w:u w:val="none"/>
-                <w:shd w:fill="auto" w:val="clear"/>
-                <w:vertAlign w:val="baseline"/>
-                <w:rtl w:val="0"/>
-              </w:rPr>
-              <w:t xml:space="preserve">RFN 02.01 - A persistência de alterações no itinerário e tipo de viagem deve garantir consistência ACID imediata </w:t>
-            </w:r>
-          </w:p>
-          <w:p>
-            <w:pPr>
-              <w:keepNext w:val="0"/>
-              <w:keepLines w:val="0"/>
-              <w:widowControl w:val="0"/>
-              <w:pBdr>
-                <w:top w:space="0" w:sz="0" w:val="nil"/>
-                <w:left w:space="0" w:sz="0" w:val="nil"/>
-                <w:bottom w:space="0" w:sz="0" w:val="nil"/>
-                <w:right w:space="0" w:sz="0" w:val="nil"/>
-                <w:between w:space="0" w:sz="0" w:val="nil"/>
-              </w:pBdr>
-              <w:shd w:fill="auto" w:val="clear"/>
-              <w:spacing w:after="0" w:before="6.00799560546875" w:line="240" w:lineRule="auto"/>
-              <w:ind w:left="132.82730102539062" w:right="0" w:firstLine="0"/>
-              <w:jc w:val="left"/>
-              <w:rPr>
-                <w:rFonts w:ascii="Arial" w:cs="Arial" w:eastAsia="Arial" w:hAnsi="Arial"/>
-                <w:b w:val="1"/>
-                <w:bCs w:val="1"/>
-                <w:i w:val="0"/>
-                <w:iCs w:val="0"/>
-                <w:smallCaps w:val="0"/>
-                <w:strike w:val="0"/>
-                <w:color w:val="000000"/>
-                <w:sz w:val="24"/>
-                <w:szCs w:val="24"/>
-                <w:u w:val="none"/>
-                <w:shd w:fill="auto" w:val="clear"/>
-                <w:vertAlign w:val="baseline"/>
-              </w:rPr>
-            </w:pPr>
-            <w:r>
-              <w:rPr>
-                <w:rFonts w:ascii="Arial" w:cs="Arial" w:eastAsia="Arial" w:hAnsi="Arial"/>
-                <w:b w:val="1"/>
-                <w:bCs w:val="1"/>
-                <w:i w:val="0"/>
-                <w:iCs w:val="0"/>
-                <w:smallCaps w:val="0"/>
-                <w:strike w:val="0"/>
-                <w:color w:val="000000"/>
-                <w:sz w:val="24"/>
-                <w:szCs w:val="24"/>
-                <w:u w:val="none"/>
-                <w:shd w:fill="auto" w:val="clear"/>
-                <w:vertAlign w:val="baseline"/>
-                <w:rtl w:val="0"/>
-              </w:rPr>
-              <w:t xml:space="preserve">no banco de dados.</w:t>
-            </w:r>
-          </w:p>
-        </w:tc>
-        <w:tc>
-          <w:tcPr>
-            <w:shd w:fill="auto" w:val="clear"/>
-            <w:tcMar>
-              <w:top w:w="100.0" w:type="dxa"/>
-              <w:left w:w="100.0" w:type="dxa"/>
-              <w:bottom w:w="100.0" w:type="dxa"/>
-              <w:right w:w="100.0" w:type="dxa"/>
-            </w:tcMar>
-            <w:vAlign w:val="top"/>
-          </w:tcPr>
-          <w:p>
-            <w:pPr>
-              <w:keepNext w:val="0"/>
-              <w:keepLines w:val="0"/>
-              <w:widowControl w:val="0"/>
-              <w:pBdr>
-                <w:top w:space="0" w:sz="0" w:val="nil"/>
-                <w:left w:space="0" w:sz="0" w:val="nil"/>
-                <w:bottom w:space="0" w:sz="0" w:val="nil"/>
-                <w:right w:space="0" w:sz="0" w:val="nil"/>
-                <w:between w:space="0" w:sz="0" w:val="nil"/>
-              </w:pBdr>
-              <w:shd w:fill="auto" w:val="clear"/>
-              <w:spacing w:after="0" w:before="0" w:line="229.88847255706787" w:lineRule="auto"/>
-              <w:ind w:left="135.6671142578125" w:right="35.04638671875" w:hanging="4.5599365234375"/>
-              <w:jc w:val="left"/>
-              <w:rPr>
-                <w:rFonts w:ascii="Arial" w:cs="Arial" w:eastAsia="Arial" w:hAnsi="Arial"/>
-                <w:b w:val="1"/>
-                <w:bCs w:val="1"/>
-                <w:i w:val="0"/>
-                <w:iCs w:val="0"/>
-                <w:smallCaps w:val="0"/>
-                <w:strike w:val="0"/>
-                <w:color w:val="000000"/>
-                <w:sz w:val="24"/>
-                <w:szCs w:val="24"/>
-                <w:u w:val="none"/>
-                <w:shd w:fill="auto" w:val="clear"/>
-                <w:vertAlign w:val="baseline"/>
-              </w:rPr>
-            </w:pPr>
-            <w:r>
-              <w:rPr>
-                <w:rFonts w:ascii="Arial" w:cs="Arial" w:eastAsia="Arial" w:hAnsi="Arial"/>
-                <w:b w:val="1"/>
-                <w:bCs w:val="1"/>
-                <w:i w:val="0"/>
-                <w:iCs w:val="0"/>
-                <w:smallCaps w:val="0"/>
-                <w:strike w:val="0"/>
-                <w:color w:val="000000"/>
-                <w:sz w:val="24"/>
-                <w:szCs w:val="24"/>
-                <w:u w:val="none"/>
-                <w:shd w:fill="auto" w:val="clear"/>
-                <w:vertAlign w:val="baseline"/>
-                <w:rtl w:val="0"/>
-              </w:rPr>
-              <w:t xml:space="preserve">O sistema não deve demorar para mostrar as sugestões</w:t>
-            </w:r>
-          </w:p>
-        </w:tc>
-        <w:tc>
-          <w:tcPr>
-            <w:shd w:fill="auto" w:val="clear"/>
-            <w:tcMar>
-              <w:top w:w="100.0" w:type="dxa"/>
-              <w:left w:w="100.0" w:type="dxa"/>
-              <w:bottom w:w="100.0" w:type="dxa"/>
-              <w:right w:w="100.0" w:type="dxa"/>
-            </w:tcMar>
-            <w:vAlign w:val="top"/>
-          </w:tcPr>
-          <w:p>
-            <w:pPr>
-              <w:keepNext w:val="0"/>
-              <w:keepLines w:val="0"/>
-              <w:widowControl w:val="0"/>
-              <w:pBdr>
-                <w:top w:space="0" w:sz="0" w:val="nil"/>
-                <w:left w:space="0" w:sz="0" w:val="nil"/>
-                <w:bottom w:space="0" w:sz="0" w:val="nil"/>
-                <w:right w:space="0" w:sz="0" w:val="nil"/>
-                <w:between w:space="0" w:sz="0" w:val="nil"/>
-              </w:pBdr>
-              <w:shd w:fill="auto" w:val="clear"/>
-              <w:spacing w:after="0" w:before="0" w:line="240" w:lineRule="auto"/>
-              <w:ind w:left="0" w:right="341.5576171875" w:firstLine="0"/>
-              <w:jc w:val="right"/>
-              <w:rPr>
-                <w:rFonts w:ascii="Arial" w:cs="Arial" w:eastAsia="Arial" w:hAnsi="Arial"/>
-                <w:b w:val="1"/>
-                <w:bCs w:val="1"/>
-                <w:i w:val="0"/>
-                <w:iCs w:val="0"/>
-                <w:smallCaps w:val="0"/>
-                <w:strike w:val="0"/>
-                <w:color w:val="000000"/>
-                <w:sz w:val="24"/>
-                <w:szCs w:val="24"/>
-                <w:u w:val="none"/>
-                <w:shd w:fill="auto" w:val="clear"/>
-                <w:vertAlign w:val="baseline"/>
-              </w:rPr>
-            </w:pPr>
-            <w:r>
-              <w:rPr>
-                <w:rFonts w:ascii="Arial" w:cs="Arial" w:eastAsia="Arial" w:hAnsi="Arial"/>
-                <w:b w:val="1"/>
-                <w:bCs w:val="1"/>
-                <w:i w:val="0"/>
-                <w:iCs w:val="0"/>
-                <w:smallCaps w:val="0"/>
-                <w:strike w:val="0"/>
-                <w:color w:val="000000"/>
-                <w:sz w:val="24"/>
-                <w:szCs w:val="24"/>
-                <w:u w:val="none"/>
-                <w:shd w:fill="auto" w:val="clear"/>
-                <w:vertAlign w:val="baseline"/>
-                <w:rtl w:val="0"/>
-              </w:rPr>
-              <w:t xml:space="preserve">Gestão do </w:t>
-            </w:r>
-          </w:p>
-          <w:p>
-            <w:pPr>
-              <w:keepNext w:val="0"/>
-              <w:keepLines w:val="0"/>
-              <w:widowControl w:val="0"/>
-              <w:pBdr>
-                <w:top w:space="0" w:sz="0" w:val="nil"/>
-                <w:left w:space="0" w:sz="0" w:val="nil"/>
-                <w:bottom w:space="0" w:sz="0" w:val="nil"/>
-                <w:right w:space="0" w:sz="0" w:val="nil"/>
-                <w:between w:space="0" w:sz="0" w:val="nil"/>
-              </w:pBdr>
-              <w:shd w:fill="auto" w:val="clear"/>
-              <w:spacing w:after="0" w:before="0" w:line="229.88847255706787" w:lineRule="auto"/>
-              <w:ind w:left="283.2196044921875" w:right="181.3232421875" w:firstLine="0"/>
-              <w:jc w:val="center"/>
-              <w:rPr>
-                <w:rFonts w:ascii="Arial" w:cs="Arial" w:eastAsia="Arial" w:hAnsi="Arial"/>
-                <w:b w:val="1"/>
-                <w:bCs w:val="1"/>
-                <w:i w:val="0"/>
-                <w:iCs w:val="0"/>
-                <w:smallCaps w:val="0"/>
-                <w:strike w:val="0"/>
-                <w:color w:val="000000"/>
-                <w:sz w:val="24"/>
-                <w:szCs w:val="24"/>
-                <w:u w:val="none"/>
-                <w:shd w:fill="auto" w:val="clear"/>
-                <w:vertAlign w:val="baseline"/>
-              </w:rPr>
-            </w:pPr>
-            <w:r>
-              <w:rPr>
-                <w:rFonts w:ascii="Arial" w:cs="Arial" w:eastAsia="Arial" w:hAnsi="Arial"/>
-                <w:b w:val="1"/>
-                <w:bCs w:val="1"/>
-                <w:i w:val="0"/>
-                <w:iCs w:val="0"/>
-                <w:smallCaps w:val="0"/>
-                <w:strike w:val="0"/>
-                <w:color w:val="000000"/>
-                <w:sz w:val="24"/>
-                <w:szCs w:val="24"/>
-                <w:u w:val="none"/>
-                <w:shd w:fill="auto" w:val="clear"/>
-                <w:vertAlign w:val="baseline"/>
-                <w:rtl w:val="0"/>
-              </w:rPr>
-              <w:t xml:space="preserve">Ciclo de Vida das Viagens </w:t>
-            </w:r>
-          </w:p>
-        </w:tc>
-        <w:tc>
-          <w:tcPr>
-            <w:shd w:fill="auto" w:val="clear"/>
-            <w:tcMar>
-              <w:top w:w="100.0" w:type="dxa"/>
-              <w:left w:w="100.0" w:type="dxa"/>
-              <w:bottom w:w="100.0" w:type="dxa"/>
-              <w:right w:w="100.0" w:type="dxa"/>
-            </w:tcMar>
-            <w:vAlign w:val="top"/>
-          </w:tcPr>
-          <w:p>
-            <w:pPr>
-              <w:keepNext w:val="0"/>
-              <w:keepLines w:val="0"/>
-              <w:widowControl w:val="0"/>
-              <w:pBdr>
-                <w:top w:space="0" w:sz="0" w:val="nil"/>
-                <w:left w:space="0" w:sz="0" w:val="nil"/>
-                <w:bottom w:space="0" w:sz="0" w:val="nil"/>
-                <w:right w:space="0" w:sz="0" w:val="nil"/>
-                <w:between w:space="0" w:sz="0" w:val="nil"/>
-              </w:pBdr>
-              <w:shd w:fill="auto" w:val="clear"/>
-              <w:spacing w:after="0" w:before="0" w:line="240" w:lineRule="auto"/>
-              <w:ind w:left="0" w:right="663.99169921875" w:firstLine="0"/>
-              <w:jc w:val="right"/>
-              <w:rPr>
-                <w:rFonts w:ascii="Arial" w:cs="Arial" w:eastAsia="Arial" w:hAnsi="Arial"/>
-                <w:b w:val="1"/>
-                <w:bCs w:val="1"/>
-                <w:i w:val="0"/>
-                <w:iCs w:val="0"/>
-                <w:smallCaps w:val="0"/>
-                <w:strike w:val="0"/>
-                <w:color w:val="000000"/>
-                <w:sz w:val="24"/>
-                <w:szCs w:val="24"/>
-                <w:u w:val="none"/>
-                <w:shd w:fill="auto" w:val="clear"/>
-                <w:vertAlign w:val="baseline"/>
-              </w:rPr>
-            </w:pPr>
-            <w:r>
-              <w:rPr>
-                <w:rFonts w:ascii="Arial" w:cs="Arial" w:eastAsia="Arial" w:hAnsi="Arial"/>
-                <w:b w:val="1"/>
-                <w:bCs w:val="1"/>
-                <w:i w:val="0"/>
-                <w:iCs w:val="0"/>
-                <w:smallCaps w:val="0"/>
-                <w:strike w:val="0"/>
-                <w:color w:val="000000"/>
-                <w:sz w:val="24"/>
-                <w:szCs w:val="24"/>
-                <w:u w:val="none"/>
-                <w:shd w:fill="auto" w:val="clear"/>
-                <w:vertAlign w:val="baseline"/>
-                <w:rtl w:val="0"/>
-              </w:rPr>
-              <w:t xml:space="preserve">Não </w:t>
-            </w:r>
-          </w:p>
-        </w:tc>
-        <w:tc>
-          <w:tcPr>
-            <w:shd w:fill="auto" w:val="clear"/>
-            <w:tcMar>
-              <w:top w:w="100.0" w:type="dxa"/>
-              <w:left w:w="100.0" w:type="dxa"/>
-              <w:bottom w:w="100.0" w:type="dxa"/>
-              <w:right w:w="100.0" w:type="dxa"/>
-            </w:tcMar>
-            <w:vAlign w:val="top"/>
-          </w:tcPr>
-          <w:p>
-            <w:pPr>
-              <w:keepNext w:val="0"/>
-              <w:keepLines w:val="0"/>
-              <w:widowControl w:val="0"/>
-              <w:pBdr>
-                <w:top w:space="0" w:sz="0" w:val="nil"/>
-                <w:left w:space="0" w:sz="0" w:val="nil"/>
-                <w:bottom w:space="0" w:sz="0" w:val="nil"/>
-                <w:right w:space="0" w:sz="0" w:val="nil"/>
-                <w:between w:space="0" w:sz="0" w:val="nil"/>
-              </w:pBdr>
-              <w:shd w:fill="auto" w:val="clear"/>
-              <w:spacing w:after="0" w:before="0" w:line="240" w:lineRule="auto"/>
-              <w:ind w:left="0" w:right="0" w:firstLine="0"/>
-              <w:jc w:val="center"/>
-              <w:rPr>
-                <w:rFonts w:ascii="Arial" w:cs="Arial" w:eastAsia="Arial" w:hAnsi="Arial"/>
-                <w:b w:val="1"/>
-                <w:bCs w:val="1"/>
-                <w:i w:val="0"/>
-                <w:iCs w:val="0"/>
-                <w:smallCaps w:val="0"/>
-                <w:strike w:val="0"/>
-                <w:color w:val="000000"/>
-                <w:sz w:val="24"/>
-                <w:szCs w:val="24"/>
-                <w:u w:val="none"/>
-                <w:shd w:fill="auto" w:val="clear"/>
-                <w:vertAlign w:val="baseline"/>
-              </w:rPr>
-            </w:pPr>
-            <w:r>
-              <w:rPr>
-                <w:rFonts w:ascii="Arial" w:cs="Arial" w:eastAsia="Arial" w:hAnsi="Arial"/>
-                <w:b w:val="1"/>
-                <w:bCs w:val="1"/>
-                <w:i w:val="0"/>
-                <w:iCs w:val="0"/>
-                <w:smallCaps w:val="0"/>
-                <w:strike w:val="0"/>
-                <w:color w:val="000000"/>
-                <w:sz w:val="24"/>
-                <w:szCs w:val="24"/>
-                <w:u w:val="none"/>
-                <w:shd w:fill="auto" w:val="clear"/>
-                <w:vertAlign w:val="baseline"/>
-                <w:rtl w:val="0"/>
-              </w:rPr>
-              <w:t xml:space="preserve">Sim</w:t>
             </w:r>
           </w:p>
         </w:tc>
@@ -7376,6 +6978,7 @@
             <w:pPr>
               <w:keepNext w:val="0"/>
               <w:keepLines w:val="0"/>
+              <w:pageBreakBefore w:val="0"/>
               <w:widowControl w:val="0"/>
               <w:pBdr>
                 <w:top w:space="0" w:sz="0" w:val="nil"/>
@@ -7386,7 +6989,7 @@
               </w:pBdr>
               <w:shd w:fill="auto" w:val="clear"/>
               <w:spacing w:after="0" w:before="0" w:line="229.88847255706787" w:lineRule="auto"/>
-              <w:ind w:left="123.4674072265625" w:right="48.11767578125" w:firstLine="9.839935302734375"/>
+              <w:ind w:left="124.42733764648438" w:right="52.001953125" w:firstLine="8.8800048828125"/>
               <w:jc w:val="both"/>
               <w:rPr>
                 <w:rFonts w:ascii="Arial" w:cs="Arial" w:eastAsia="Arial" w:hAnsi="Arial"/>
@@ -7421,13 +7024,14 @@
                 <w:vertAlign w:val="baseline"/>
                 <w:rtl w:val="0"/>
               </w:rPr>
-              <w:t xml:space="preserve">RFN 02.02 -O sistema não deve perder as configurações e locais salvos como favoritos ao alternar ou editar os </w:t>
+              <w:t xml:space="preserve">RFN 02.01 - A persistência de alterações no itinerário e tipo de viagem deve garantir consistência ACID imediata </w:t>
             </w:r>
           </w:p>
           <w:p>
             <w:pPr>
               <w:keepNext w:val="0"/>
               <w:keepLines w:val="0"/>
+              <w:pageBreakBefore w:val="0"/>
               <w:widowControl w:val="0"/>
               <w:pBdr>
                 <w:top w:space="0" w:sz="0" w:val="nil"/>
@@ -7438,7 +7042,7 @@
               </w:pBdr>
               <w:shd w:fill="auto" w:val="clear"/>
               <w:spacing w:after="0" w:before="6.00799560546875" w:line="240" w:lineRule="auto"/>
-              <w:ind w:left="132.10739135742188" w:right="0" w:firstLine="0"/>
+              <w:ind w:left="132.82730102539062" w:right="0" w:firstLine="0"/>
               <w:jc w:val="left"/>
               <w:rPr>
                 <w:rFonts w:ascii="Arial" w:cs="Arial" w:eastAsia="Arial" w:hAnsi="Arial"/>
@@ -7473,7 +7077,7 @@
                 <w:vertAlign w:val="baseline"/>
                 <w:rtl w:val="0"/>
               </w:rPr>
-              <w:t xml:space="preserve">parâmetros da viagem.</w:t>
+              <w:t xml:space="preserve">no banco de dados.</w:t>
             </w:r>
           </w:p>
         </w:tc>
@@ -7492,6 +7096,7 @@
             <w:pPr>
               <w:keepNext w:val="0"/>
               <w:keepLines w:val="0"/>
+              <w:pageBreakBefore w:val="0"/>
               <w:widowControl w:val="0"/>
               <w:pBdr>
                 <w:top w:space="0" w:sz="0" w:val="nil"/>
@@ -7501,8 +7106,8 @@
                 <w:between w:space="0" w:sz="0" w:val="nil"/>
               </w:pBdr>
               <w:shd w:fill="auto" w:val="clear"/>
-              <w:spacing w:after="0" w:before="0" w:line="276" w:lineRule="auto"/>
-              <w:ind w:left="0" w:right="0" w:firstLine="0"/>
+              <w:spacing w:after="0" w:before="0" w:line="229.88847255706787" w:lineRule="auto"/>
+              <w:ind w:left="135.6671142578125" w:right="35.04638671875" w:hanging="4.5599365234375"/>
               <w:jc w:val="left"/>
               <w:rPr>
                 <w:rFonts w:ascii="Arial" w:cs="Arial" w:eastAsia="Arial" w:hAnsi="Arial"/>
@@ -7522,8 +7127,22 @@
             </w:pPr>
             <w:r>
               <w:rPr>
-                <w:rtl w:val="0"/>
-              </w:rPr>
+                <w:rFonts w:ascii="Arial" w:cs="Arial" w:eastAsia="Arial" w:hAnsi="Arial"/>
+                <w:b w:val="1"/>
+                <w:bCs w:val="1"/>
+                <w:i w:val="0"/>
+                <w:iCs w:val="0"/>
+                <w:smallCaps w:val="0"/>
+                <w:strike w:val="0"/>
+                <w:color w:val="000000"/>
+                <w:sz w:val="24"/>
+                <w:szCs w:val="24"/>
+                <w:u w:val="none"/>
+                <w:shd w:fill="auto" w:val="clear"/>
+                <w:vertAlign w:val="baseline"/>
+                <w:rtl w:val="0"/>
+              </w:rPr>
+              <w:t xml:space="preserve">O sistema não deve demorar para mostrar as sugestões</w:t>
             </w:r>
           </w:p>
         </w:tc>
@@ -7542,6 +7161,7 @@
             <w:pPr>
               <w:keepNext w:val="0"/>
               <w:keepLines w:val="0"/>
+              <w:pageBreakBefore w:val="0"/>
               <w:widowControl w:val="0"/>
               <w:pBdr>
                 <w:top w:space="0" w:sz="0" w:val="nil"/>
@@ -7551,9 +7171,9 @@
                 <w:between w:space="0" w:sz="0" w:val="nil"/>
               </w:pBdr>
               <w:shd w:fill="auto" w:val="clear"/>
-              <w:spacing w:after="0" w:before="0" w:line="276" w:lineRule="auto"/>
-              <w:ind w:left="0" w:right="0" w:firstLine="0"/>
-              <w:jc w:val="left"/>
+              <w:spacing w:after="0" w:before="0" w:line="240" w:lineRule="auto"/>
+              <w:ind w:left="0" w:right="341.5576171875" w:firstLine="0"/>
+              <w:jc w:val="right"/>
               <w:rPr>
                 <w:rFonts w:ascii="Arial" w:cs="Arial" w:eastAsia="Arial" w:hAnsi="Arial"/>
                 <w:b w:val="1"/>
@@ -7572,8 +7192,75 @@
             </w:pPr>
             <w:r>
               <w:rPr>
-                <w:rtl w:val="0"/>
-              </w:rPr>
+                <w:rFonts w:ascii="Arial" w:cs="Arial" w:eastAsia="Arial" w:hAnsi="Arial"/>
+                <w:b w:val="1"/>
+                <w:bCs w:val="1"/>
+                <w:i w:val="0"/>
+                <w:iCs w:val="0"/>
+                <w:smallCaps w:val="0"/>
+                <w:strike w:val="0"/>
+                <w:color w:val="000000"/>
+                <w:sz w:val="24"/>
+                <w:szCs w:val="24"/>
+                <w:u w:val="none"/>
+                <w:shd w:fill="auto" w:val="clear"/>
+                <w:vertAlign w:val="baseline"/>
+                <w:rtl w:val="0"/>
+              </w:rPr>
+              <w:t xml:space="preserve">Gestão do </w:t>
+            </w:r>
+          </w:p>
+          <w:p>
+            <w:pPr>
+              <w:keepNext w:val="0"/>
+              <w:keepLines w:val="0"/>
+              <w:pageBreakBefore w:val="0"/>
+              <w:widowControl w:val="0"/>
+              <w:pBdr>
+                <w:top w:space="0" w:sz="0" w:val="nil"/>
+                <w:left w:space="0" w:sz="0" w:val="nil"/>
+                <w:bottom w:space="0" w:sz="0" w:val="nil"/>
+                <w:right w:space="0" w:sz="0" w:val="nil"/>
+                <w:between w:space="0" w:sz="0" w:val="nil"/>
+              </w:pBdr>
+              <w:shd w:fill="auto" w:val="clear"/>
+              <w:spacing w:after="0" w:before="0" w:line="229.88847255706787" w:lineRule="auto"/>
+              <w:ind w:left="283.2196044921875" w:right="181.3232421875" w:firstLine="0"/>
+              <w:jc w:val="center"/>
+              <w:rPr>
+                <w:rFonts w:ascii="Arial" w:cs="Arial" w:eastAsia="Arial" w:hAnsi="Arial"/>
+                <w:b w:val="1"/>
+                <w:bCs w:val="1"/>
+                <w:i w:val="0"/>
+                <w:iCs w:val="0"/>
+                <w:smallCaps w:val="0"/>
+                <w:strike w:val="0"/>
+                <w:color w:val="000000"/>
+                <w:sz w:val="24"/>
+                <w:szCs w:val="24"/>
+                <w:u w:val="none"/>
+                <w:shd w:fill="auto" w:val="clear"/>
+                <w:vertAlign w:val="baseline"/>
+              </w:rPr>
+            </w:pPr>
+            <w:r>
+              <w:rPr>
+                <w:rFonts w:ascii="Arial" w:cs="Arial" w:eastAsia="Arial" w:hAnsi="Arial"/>
+                <w:b w:val="1"/>
+                <w:bCs w:val="1"/>
+                <w:i w:val="0"/>
+                <w:iCs w:val="0"/>
+                <w:smallCaps w:val="0"/>
+                <w:strike w:val="0"/>
+                <w:color w:val="000000"/>
+                <w:sz w:val="24"/>
+                <w:szCs w:val="24"/>
+                <w:u w:val="none"/>
+                <w:shd w:fill="auto" w:val="clear"/>
+                <w:vertAlign w:val="baseline"/>
+                <w:rtl w:val="0"/>
+              </w:rPr>
+              <w:t xml:space="preserve">Ciclo de Vida das Viagens </w:t>
             </w:r>
           </w:p>
         </w:tc>
@@ -7592,6 +7279,7 @@
             <w:pPr>
               <w:keepNext w:val="0"/>
               <w:keepLines w:val="0"/>
+              <w:pageBreakBefore w:val="0"/>
               <w:widowControl w:val="0"/>
               <w:pBdr>
                 <w:top w:space="0" w:sz="0" w:val="nil"/>
@@ -7601,9 +7289,9 @@
                 <w:between w:space="0" w:sz="0" w:val="nil"/>
               </w:pBdr>
               <w:shd w:fill="auto" w:val="clear"/>
-              <w:spacing w:after="0" w:before="0" w:line="276" w:lineRule="auto"/>
-              <w:ind w:left="0" w:right="0" w:firstLine="0"/>
-              <w:jc w:val="left"/>
+              <w:spacing w:after="0" w:before="0" w:line="240" w:lineRule="auto"/>
+              <w:ind w:left="0" w:right="663.99169921875" w:firstLine="0"/>
+              <w:jc w:val="right"/>
               <w:rPr>
                 <w:rFonts w:ascii="Arial" w:cs="Arial" w:eastAsia="Arial" w:hAnsi="Arial"/>
                 <w:b w:val="1"/>
@@ -7622,8 +7310,22 @@
             </w:pPr>
             <w:r>
               <w:rPr>
-                <w:rtl w:val="0"/>
-              </w:rPr>
+                <w:rFonts w:ascii="Arial" w:cs="Arial" w:eastAsia="Arial" w:hAnsi="Arial"/>
+                <w:b w:val="1"/>
+                <w:bCs w:val="1"/>
+                <w:i w:val="0"/>
+                <w:iCs w:val="0"/>
+                <w:smallCaps w:val="0"/>
+                <w:strike w:val="0"/>
+                <w:color w:val="000000"/>
+                <w:sz w:val="24"/>
+                <w:szCs w:val="24"/>
+                <w:u w:val="none"/>
+                <w:shd w:fill="auto" w:val="clear"/>
+                <w:vertAlign w:val="baseline"/>
+                <w:rtl w:val="0"/>
+              </w:rPr>
+              <w:t xml:space="preserve">Não </w:t>
             </w:r>
           </w:p>
         </w:tc>
@@ -7642,6 +7344,379 @@
             <w:pPr>
               <w:keepNext w:val="0"/>
               <w:keepLines w:val="0"/>
+              <w:pageBreakBefore w:val="0"/>
+              <w:widowControl w:val="0"/>
+              <w:pBdr>
+                <w:top w:space="0" w:sz="0" w:val="nil"/>
+                <w:left w:space="0" w:sz="0" w:val="nil"/>
+                <w:bottom w:space="0" w:sz="0" w:val="nil"/>
+                <w:right w:space="0" w:sz="0" w:val="nil"/>
+                <w:between w:space="0" w:sz="0" w:val="nil"/>
+              </w:pBdr>
+              <w:shd w:fill="auto" w:val="clear"/>
+              <w:spacing w:after="0" w:before="0" w:line="240" w:lineRule="auto"/>
+              <w:ind w:left="0" w:right="0" w:firstLine="0"/>
+              <w:jc w:val="center"/>
+              <w:rPr>
+                <w:rFonts w:ascii="Arial" w:cs="Arial" w:eastAsia="Arial" w:hAnsi="Arial"/>
+                <w:b w:val="1"/>
+                <w:bCs w:val="1"/>
+                <w:i w:val="0"/>
+                <w:iCs w:val="0"/>
+                <w:smallCaps w:val="0"/>
+                <w:strike w:val="0"/>
+                <w:color w:val="000000"/>
+                <w:sz w:val="24"/>
+                <w:szCs w:val="24"/>
+                <w:u w:val="none"/>
+                <w:shd w:fill="auto" w:val="clear"/>
+                <w:vertAlign w:val="baseline"/>
+              </w:rPr>
+            </w:pPr>
+            <w:r>
+              <w:rPr>
+                <w:rFonts w:ascii="Arial" w:cs="Arial" w:eastAsia="Arial" w:hAnsi="Arial"/>
+                <w:b w:val="1"/>
+                <w:bCs w:val="1"/>
+                <w:i w:val="0"/>
+                <w:iCs w:val="0"/>
+                <w:smallCaps w:val="0"/>
+                <w:strike w:val="0"/>
+                <w:color w:val="000000"/>
+                <w:sz w:val="24"/>
+                <w:szCs w:val="24"/>
+                <w:u w:val="none"/>
+                <w:shd w:fill="auto" w:val="clear"/>
+                <w:vertAlign w:val="baseline"/>
+                <w:rtl w:val="0"/>
+              </w:rPr>
+              <w:t xml:space="preserve">Sim</w:t>
+            </w:r>
+          </w:p>
+        </w:tc>
+      </w:tr>
+      <w:tr>
+        <w:trPr>
+          <w:cantSplit w:val="0"/>
+          <w:trHeight w:val="1600" w:hRule="atLeast"/>
+          <w:tblHeader w:val="0"/>
+        </w:trPr>
+        <w:tc>
+          <w:tcPr>
+            <w:shd w:fill="auto" w:val="clear"/>
+            <w:tcMar>
+              <w:top w:w="100.0" w:type="dxa"/>
+              <w:left w:w="100.0" w:type="dxa"/>
+              <w:bottom w:w="100.0" w:type="dxa"/>
+              <w:right w:w="100.0" w:type="dxa"/>
+            </w:tcMar>
+            <w:vAlign w:val="top"/>
+          </w:tcPr>
+          <w:p>
+            <w:pPr>
+              <w:keepNext w:val="0"/>
+              <w:keepLines w:val="0"/>
+              <w:pageBreakBefore w:val="0"/>
+              <w:widowControl w:val="0"/>
+              <w:pBdr>
+                <w:top w:space="0" w:sz="0" w:val="nil"/>
+                <w:left w:space="0" w:sz="0" w:val="nil"/>
+                <w:bottom w:space="0" w:sz="0" w:val="nil"/>
+                <w:right w:space="0" w:sz="0" w:val="nil"/>
+                <w:between w:space="0" w:sz="0" w:val="nil"/>
+              </w:pBdr>
+              <w:shd w:fill="auto" w:val="clear"/>
+              <w:spacing w:after="0" w:before="0" w:line="229.88847255706787" w:lineRule="auto"/>
+              <w:ind w:left="123.4674072265625" w:right="48.11767578125" w:firstLine="9.839935302734375"/>
+              <w:jc w:val="both"/>
+              <w:rPr>
+                <w:rFonts w:ascii="Arial" w:cs="Arial" w:eastAsia="Arial" w:hAnsi="Arial"/>
+                <w:b w:val="1"/>
+                <w:bCs w:val="1"/>
+                <w:i w:val="0"/>
+                <w:iCs w:val="0"/>
+                <w:smallCaps w:val="0"/>
+                <w:strike w:val="0"/>
+                <w:color w:val="000000"/>
+                <w:sz w:val="24"/>
+                <w:szCs w:val="24"/>
+                <w:u w:val="none"/>
+                <w:shd w:fill="auto" w:val="clear"/>
+                <w:vertAlign w:val="baseline"/>
+              </w:rPr>
+            </w:pPr>
+            <w:r>
+              <w:rPr>
+                <w:rFonts w:ascii="Arial" w:cs="Arial" w:eastAsia="Arial" w:hAnsi="Arial"/>
+                <w:b w:val="1"/>
+                <w:bCs w:val="1"/>
+                <w:i w:val="0"/>
+                <w:iCs w:val="0"/>
+                <w:smallCaps w:val="0"/>
+                <w:strike w:val="0"/>
+                <w:color w:val="000000"/>
+                <w:sz w:val="24"/>
+                <w:szCs w:val="24"/>
+                <w:u w:val="none"/>
+                <w:shd w:fill="auto" w:val="clear"/>
+                <w:vertAlign w:val="baseline"/>
+                <w:rtl w:val="0"/>
+              </w:rPr>
+              <w:t xml:space="preserve">RFN 02.02 -O sistema não deve perder as configurações e locais salvos como favoritos ao </w:t>
+            </w:r>
+            <w:r>
+              <w:rPr>
+                <w:b w:val="1"/>
+                <w:bCs w:val="1"/>
+                <w:sz w:val="24"/>
+                <w:szCs w:val="24"/>
+                <w:rtl w:val="0"/>
+              </w:rPr>
+              <w:t xml:space="preserve">alterar</w:t>
+            </w:r>
+            <w:r>
+              <w:rPr>
+                <w:rFonts w:ascii="Arial" w:cs="Arial" w:eastAsia="Arial" w:hAnsi="Arial"/>
+                <w:b w:val="1"/>
+                <w:bCs w:val="1"/>
+                <w:i w:val="0"/>
+                <w:iCs w:val="0"/>
+                <w:smallCaps w:val="0"/>
+                <w:strike w:val="0"/>
+                <w:color w:val="000000"/>
+                <w:sz w:val="24"/>
+                <w:szCs w:val="24"/>
+                <w:u w:val="none"/>
+                <w:shd w:fill="auto" w:val="clear"/>
+                <w:vertAlign w:val="baseline"/>
+                <w:rtl w:val="0"/>
+              </w:rPr>
+              <w:t xml:space="preserve"> ou editar os </w:t>
+            </w:r>
+          </w:p>
+          <w:p>
+            <w:pPr>
+              <w:keepNext w:val="0"/>
+              <w:keepLines w:val="0"/>
+              <w:pageBreakBefore w:val="0"/>
+              <w:widowControl w:val="0"/>
+              <w:pBdr>
+                <w:top w:space="0" w:sz="0" w:val="nil"/>
+                <w:left w:space="0" w:sz="0" w:val="nil"/>
+                <w:bottom w:space="0" w:sz="0" w:val="nil"/>
+                <w:right w:space="0" w:sz="0" w:val="nil"/>
+                <w:between w:space="0" w:sz="0" w:val="nil"/>
+              </w:pBdr>
+              <w:shd w:fill="auto" w:val="clear"/>
+              <w:spacing w:after="0" w:before="6.00799560546875" w:line="240" w:lineRule="auto"/>
+              <w:ind w:left="132.10739135742188" w:right="0" w:firstLine="0"/>
+              <w:jc w:val="left"/>
+              <w:rPr>
+                <w:rFonts w:ascii="Arial" w:cs="Arial" w:eastAsia="Arial" w:hAnsi="Arial"/>
+                <w:b w:val="1"/>
+                <w:bCs w:val="1"/>
+                <w:i w:val="0"/>
+                <w:iCs w:val="0"/>
+                <w:smallCaps w:val="0"/>
+                <w:strike w:val="0"/>
+                <w:color w:val="000000"/>
+                <w:sz w:val="24"/>
+                <w:szCs w:val="24"/>
+                <w:u w:val="none"/>
+                <w:shd w:fill="auto" w:val="clear"/>
+                <w:vertAlign w:val="baseline"/>
+              </w:rPr>
+            </w:pPr>
+            <w:r>
+              <w:rPr>
+                <w:rFonts w:ascii="Arial" w:cs="Arial" w:eastAsia="Arial" w:hAnsi="Arial"/>
+                <w:b w:val="1"/>
+                <w:bCs w:val="1"/>
+                <w:i w:val="0"/>
+                <w:iCs w:val="0"/>
+                <w:smallCaps w:val="0"/>
+                <w:strike w:val="0"/>
+                <w:color w:val="000000"/>
+                <w:sz w:val="24"/>
+                <w:szCs w:val="24"/>
+                <w:u w:val="none"/>
+                <w:shd w:fill="auto" w:val="clear"/>
+                <w:vertAlign w:val="baseline"/>
+                <w:rtl w:val="0"/>
+              </w:rPr>
+              <w:t xml:space="preserve">parâmetros da viagem.</w:t>
+            </w:r>
+          </w:p>
+        </w:tc>
+        <w:tc>
+          <w:tcPr>
+            <w:shd w:fill="auto" w:val="clear"/>
+            <w:tcMar>
+              <w:top w:w="100.0" w:type="dxa"/>
+              <w:left w:w="100.0" w:type="dxa"/>
+              <w:bottom w:w="100.0" w:type="dxa"/>
+              <w:right w:w="100.0" w:type="dxa"/>
+            </w:tcMar>
+            <w:vAlign w:val="top"/>
+          </w:tcPr>
+          <w:p>
+            <w:pPr>
+              <w:keepNext w:val="0"/>
+              <w:keepLines w:val="0"/>
+              <w:pageBreakBefore w:val="0"/>
+              <w:widowControl w:val="0"/>
+              <w:pBdr>
+                <w:top w:space="0" w:sz="0" w:val="nil"/>
+                <w:left w:space="0" w:sz="0" w:val="nil"/>
+                <w:bottom w:space="0" w:sz="0" w:val="nil"/>
+                <w:right w:space="0" w:sz="0" w:val="nil"/>
+                <w:between w:space="0" w:sz="0" w:val="nil"/>
+              </w:pBdr>
+              <w:shd w:fill="auto" w:val="clear"/>
+              <w:spacing w:after="0" w:before="0" w:line="276" w:lineRule="auto"/>
+              <w:ind w:left="0" w:right="0" w:firstLine="0"/>
+              <w:jc w:val="left"/>
+              <w:rPr>
+                <w:rFonts w:ascii="Arial" w:cs="Arial" w:eastAsia="Arial" w:hAnsi="Arial"/>
+                <w:b w:val="1"/>
+                <w:bCs w:val="1"/>
+                <w:i w:val="0"/>
+                <w:iCs w:val="0"/>
+                <w:smallCaps w:val="0"/>
+                <w:strike w:val="0"/>
+                <w:color w:val="000000"/>
+                <w:sz w:val="24"/>
+                <w:szCs w:val="24"/>
+                <w:u w:val="none"/>
+                <w:shd w:fill="auto" w:val="clear"/>
+                <w:vertAlign w:val="baseline"/>
+              </w:rPr>
+            </w:pPr>
+            <w:r>
+              <w:rPr>
+                <w:rtl w:val="0"/>
+              </w:rPr>
+            </w:r>
+          </w:p>
+        </w:tc>
+        <w:tc>
+          <w:tcPr>
+            <w:shd w:fill="auto" w:val="clear"/>
+            <w:tcMar>
+              <w:top w:w="100.0" w:type="dxa"/>
+              <w:left w:w="100.0" w:type="dxa"/>
+              <w:bottom w:w="100.0" w:type="dxa"/>
+              <w:right w:w="100.0" w:type="dxa"/>
+            </w:tcMar>
+            <w:vAlign w:val="top"/>
+          </w:tcPr>
+          <w:p>
+            <w:pPr>
+              <w:keepNext w:val="0"/>
+              <w:keepLines w:val="0"/>
+              <w:pageBreakBefore w:val="0"/>
+              <w:widowControl w:val="0"/>
+              <w:pBdr>
+                <w:top w:space="0" w:sz="0" w:val="nil"/>
+                <w:left w:space="0" w:sz="0" w:val="nil"/>
+                <w:bottom w:space="0" w:sz="0" w:val="nil"/>
+                <w:right w:space="0" w:sz="0" w:val="nil"/>
+                <w:between w:space="0" w:sz="0" w:val="nil"/>
+              </w:pBdr>
+              <w:shd w:fill="auto" w:val="clear"/>
+              <w:spacing w:after="0" w:before="0" w:line="276" w:lineRule="auto"/>
+              <w:ind w:left="0" w:right="0" w:firstLine="0"/>
+              <w:jc w:val="left"/>
+              <w:rPr>
+                <w:rFonts w:ascii="Arial" w:cs="Arial" w:eastAsia="Arial" w:hAnsi="Arial"/>
+                <w:b w:val="1"/>
+                <w:bCs w:val="1"/>
+                <w:i w:val="0"/>
+                <w:iCs w:val="0"/>
+                <w:smallCaps w:val="0"/>
+                <w:strike w:val="0"/>
+                <w:color w:val="000000"/>
+                <w:sz w:val="24"/>
+                <w:szCs w:val="24"/>
+                <w:u w:val="none"/>
+                <w:shd w:fill="auto" w:val="clear"/>
+                <w:vertAlign w:val="baseline"/>
+              </w:rPr>
+            </w:pPr>
+            <w:r>
+              <w:rPr>
+                <w:rtl w:val="0"/>
+              </w:rPr>
+            </w:r>
+          </w:p>
+        </w:tc>
+        <w:tc>
+          <w:tcPr>
+            <w:shd w:fill="auto" w:val="clear"/>
+            <w:tcMar>
+              <w:top w:w="100.0" w:type="dxa"/>
+              <w:left w:w="100.0" w:type="dxa"/>
+              <w:bottom w:w="100.0" w:type="dxa"/>
+              <w:right w:w="100.0" w:type="dxa"/>
+            </w:tcMar>
+            <w:vAlign w:val="top"/>
+          </w:tcPr>
+          <w:p>
+            <w:pPr>
+              <w:keepNext w:val="0"/>
+              <w:keepLines w:val="0"/>
+              <w:pageBreakBefore w:val="0"/>
+              <w:widowControl w:val="0"/>
+              <w:pBdr>
+                <w:top w:space="0" w:sz="0" w:val="nil"/>
+                <w:left w:space="0" w:sz="0" w:val="nil"/>
+                <w:bottom w:space="0" w:sz="0" w:val="nil"/>
+                <w:right w:space="0" w:sz="0" w:val="nil"/>
+                <w:between w:space="0" w:sz="0" w:val="nil"/>
+              </w:pBdr>
+              <w:shd w:fill="auto" w:val="clear"/>
+              <w:spacing w:after="0" w:before="0" w:line="276" w:lineRule="auto"/>
+              <w:ind w:left="0" w:right="0" w:firstLine="0"/>
+              <w:jc w:val="left"/>
+              <w:rPr>
+                <w:rFonts w:ascii="Arial" w:cs="Arial" w:eastAsia="Arial" w:hAnsi="Arial"/>
+                <w:b w:val="1"/>
+                <w:bCs w:val="1"/>
+                <w:i w:val="0"/>
+                <w:iCs w:val="0"/>
+                <w:smallCaps w:val="0"/>
+                <w:strike w:val="0"/>
+                <w:color w:val="000000"/>
+                <w:sz w:val="24"/>
+                <w:szCs w:val="24"/>
+                <w:u w:val="none"/>
+                <w:shd w:fill="auto" w:val="clear"/>
+                <w:vertAlign w:val="baseline"/>
+              </w:rPr>
+            </w:pPr>
+            <w:r>
+              <w:rPr>
+                <w:rtl w:val="0"/>
+              </w:rPr>
+            </w:r>
+          </w:p>
+        </w:tc>
+        <w:tc>
+          <w:tcPr>
+            <w:shd w:fill="auto" w:val="clear"/>
+            <w:tcMar>
+              <w:top w:w="100.0" w:type="dxa"/>
+              <w:left w:w="100.0" w:type="dxa"/>
+              <w:bottom w:w="100.0" w:type="dxa"/>
+              <w:right w:w="100.0" w:type="dxa"/>
+            </w:tcMar>
+            <w:vAlign w:val="top"/>
+          </w:tcPr>
+          <w:p>
+            <w:pPr>
+              <w:keepNext w:val="0"/>
+              <w:keepLines w:val="0"/>
+              <w:pageBreakBefore w:val="0"/>
               <w:widowControl w:val="0"/>
               <w:pBdr>
                 <w:top w:space="0" w:sz="0" w:val="nil"/>
@@ -7699,6 +7774,7 @@
             <w:pPr>
               <w:keepNext w:val="0"/>
               <w:keepLines w:val="0"/>
+              <w:pageBreakBefore w:val="0"/>
               <w:widowControl w:val="0"/>
               <w:pBdr>
                 <w:top w:space="0" w:sz="0" w:val="nil"/>
@@ -7763,6 +7839,7 @@
             <w:pPr>
               <w:keepNext w:val="0"/>
               <w:keepLines w:val="0"/>
+              <w:pageBreakBefore w:val="0"/>
               <w:widowControl w:val="0"/>
               <w:pBdr>
                 <w:top w:space="0" w:sz="0" w:val="nil"/>
@@ -7813,6 +7890,7 @@
             <w:pPr>
               <w:keepNext w:val="0"/>
               <w:keepLines w:val="0"/>
+              <w:pageBreakBefore w:val="0"/>
               <w:widowControl w:val="0"/>
               <w:pBdr>
                 <w:top w:space="0" w:sz="0" w:val="nil"/>
@@ -7863,6 +7941,7 @@
             <w:pPr>
               <w:keepNext w:val="0"/>
               <w:keepLines w:val="0"/>
+              <w:pageBreakBefore w:val="0"/>
               <w:widowControl w:val="0"/>
               <w:pBdr>
                 <w:top w:space="0" w:sz="0" w:val="nil"/>
@@ -7913,6 +7992,7 @@
             <w:pPr>
               <w:keepNext w:val="0"/>
               <w:keepLines w:val="0"/>
+              <w:pageBreakBefore w:val="0"/>
               <w:widowControl w:val="0"/>
               <w:pBdr>
                 <w:top w:space="0" w:sz="0" w:val="nil"/>
@@ -7999,6 +8079,9 @@
         </w:rPr>
       </w:pPr>
       <w:r>
+        <w:br w:type="page"/>
+      </w:r>
+      <w:r>
         <w:rPr>
           <w:rtl w:val="0"/>
         </w:rPr>
@@ -8019,6 +8102,1034 @@
         </w:rPr>
       </w:r>
     </w:p>
+    <w:tbl>
+      <w:tblPr>
+        <w:tblStyle w:val="Table4"/>
+        <w:tblW w:w="14310.0" w:type="dxa"/>
+        <w:jc w:val="left"/>
+        <w:tblBorders>
+          <w:top w:color="000000" w:space="0" w:sz="8" w:val="single"/>
+          <w:left w:color="000000" w:space="0" w:sz="8" w:val="single"/>
+          <w:bottom w:color="000000" w:space="0" w:sz="8" w:val="single"/>
+          <w:right w:color="000000" w:space="0" w:sz="8" w:val="single"/>
+          <w:insideH w:color="000000" w:space="0" w:sz="8" w:val="single"/>
+          <w:insideV w:color="000000" w:space="0" w:sz="8" w:val="single"/>
+        </w:tblBorders>
+        <w:tblLayout w:type="fixed"/>
+        <w:tblLook w:val="0600"/>
+      </w:tblPr>
+      <w:tblGrid>
+        <w:gridCol w:w="1800"/>
+        <w:gridCol w:w="12510"/>
+        <w:tblGridChange w:id="0">
+          <w:tblGrid>
+            <w:gridCol w:w="1800"/>
+            <w:gridCol w:w="12510"/>
+          </w:tblGrid>
+        </w:tblGridChange>
+      </w:tblGrid>
+      <w:tr>
+        <w:trPr>
+          <w:cantSplit w:val="0"/>
+          <w:tblHeader w:val="0"/>
+        </w:trPr>
+        <w:tc>
+          <w:tcPr>
+            <w:shd w:fill="999999" w:val="clear"/>
+            <w:tcMar>
+              <w:top w:w="100.0" w:type="dxa"/>
+              <w:left w:w="100.0" w:type="dxa"/>
+              <w:bottom w:w="100.0" w:type="dxa"/>
+              <w:right w:w="100.0" w:type="dxa"/>
+            </w:tcMar>
+            <w:vAlign w:val="top"/>
+          </w:tcPr>
+          <w:p>
+            <w:pPr>
+              <w:widowControl w:val="0"/>
+              <w:spacing w:line="240" w:lineRule="auto"/>
+              <w:rPr>
+                <w:b w:val="1"/>
+                <w:bCs w:val="1"/>
+                <w:sz w:val="24"/>
+                <w:szCs w:val="24"/>
+              </w:rPr>
+            </w:pPr>
+            <w:r>
+              <w:rPr>
+                <w:b w:val="1"/>
+                <w:bCs w:val="1"/>
+                <w:sz w:val="24"/>
+                <w:szCs w:val="24"/>
+                <w:rtl w:val="0"/>
+              </w:rPr>
+              <w:t xml:space="preserve">CASO DE USO EXPANDIDO - 001</w:t>
+            </w:r>
+          </w:p>
+        </w:tc>
+        <w:tc>
+          <w:tcPr>
+            <w:shd w:fill="999999" w:val="clear"/>
+            <w:tcMar>
+              <w:top w:w="100.0" w:type="dxa"/>
+              <w:left w:w="100.0" w:type="dxa"/>
+              <w:bottom w:w="100.0" w:type="dxa"/>
+              <w:right w:w="100.0" w:type="dxa"/>
+            </w:tcMar>
+            <w:vAlign w:val="top"/>
+          </w:tcPr>
+          <w:p>
+            <w:pPr>
+              <w:widowControl w:val="0"/>
+              <w:spacing w:line="240" w:lineRule="auto"/>
+              <w:rPr>
+                <w:b w:val="1"/>
+                <w:bCs w:val="1"/>
+                <w:sz w:val="24"/>
+                <w:szCs w:val="24"/>
+              </w:rPr>
+            </w:pPr>
+            <w:r>
+              <w:rPr>
+                <w:rtl w:val="0"/>
+              </w:rPr>
+            </w:r>
+          </w:p>
+        </w:tc>
+      </w:tr>
+      <w:tr>
+        <w:trPr>
+          <w:cantSplit w:val="0"/>
+          <w:tblHeader w:val="0"/>
+        </w:trPr>
+        <w:tc>
+          <w:tcPr>
+            <w:shd w:fill="999999" w:val="clear"/>
+            <w:tcMar>
+              <w:top w:w="100.0" w:type="dxa"/>
+              <w:left w:w="100.0" w:type="dxa"/>
+              <w:bottom w:w="100.0" w:type="dxa"/>
+              <w:right w:w="100.0" w:type="dxa"/>
+            </w:tcMar>
+            <w:vAlign w:val="top"/>
+          </w:tcPr>
+          <w:p>
+            <w:pPr>
+              <w:widowControl w:val="0"/>
+              <w:spacing w:line="240" w:lineRule="auto"/>
+              <w:rPr>
+                <w:b w:val="1"/>
+                <w:bCs w:val="1"/>
+                <w:sz w:val="24"/>
+                <w:szCs w:val="24"/>
+              </w:rPr>
+            </w:pPr>
+            <w:r>
+              <w:rPr>
+                <w:b w:val="1"/>
+                <w:bCs w:val="1"/>
+                <w:sz w:val="24"/>
+                <w:szCs w:val="24"/>
+                <w:rtl w:val="0"/>
+              </w:rPr>
+              <w:t xml:space="preserve">Ator Principal: </w:t>
+            </w:r>
+          </w:p>
+        </w:tc>
+        <w:tc>
+          <w:tcPr>
+            <w:shd w:fill="auto" w:val="clear"/>
+            <w:tcMar>
+              <w:top w:w="100.0" w:type="dxa"/>
+              <w:left w:w="100.0" w:type="dxa"/>
+              <w:bottom w:w="100.0" w:type="dxa"/>
+              <w:right w:w="100.0" w:type="dxa"/>
+            </w:tcMar>
+            <w:vAlign w:val="top"/>
+          </w:tcPr>
+          <w:p>
+            <w:pPr>
+              <w:rPr/>
+            </w:pPr>
+            <w:r>
+              <w:rPr>
+                <w:rtl w:val="0"/>
+              </w:rPr>
+              <w:t xml:space="preserve">Viajante Solo (Cliente)</w:t>
+            </w:r>
+          </w:p>
+          <w:p>
+            <w:pPr>
+              <w:widowControl w:val="0"/>
+              <w:spacing w:line="240" w:lineRule="auto"/>
+              <w:rPr>
+                <w:sz w:val="24"/>
+                <w:szCs w:val="24"/>
+              </w:rPr>
+            </w:pPr>
+            <w:r>
+              <w:rPr>
+                <w:rtl w:val="0"/>
+              </w:rPr>
+            </w:r>
+          </w:p>
+        </w:tc>
+      </w:tr>
+      <w:tr>
+        <w:trPr>
+          <w:cantSplit w:val="0"/>
+          <w:tblHeader w:val="0"/>
+        </w:trPr>
+        <w:tc>
+          <w:tcPr>
+            <w:shd w:fill="999999" w:val="clear"/>
+            <w:tcMar>
+              <w:top w:w="100.0" w:type="dxa"/>
+              <w:left w:w="100.0" w:type="dxa"/>
+              <w:bottom w:w="100.0" w:type="dxa"/>
+              <w:right w:w="100.0" w:type="dxa"/>
+            </w:tcMar>
+            <w:vAlign w:val="top"/>
+          </w:tcPr>
+          <w:p>
+            <w:pPr>
+              <w:widowControl w:val="0"/>
+              <w:spacing w:line="240" w:lineRule="auto"/>
+              <w:rPr>
+                <w:b w:val="1"/>
+                <w:bCs w:val="1"/>
+                <w:sz w:val="24"/>
+                <w:szCs w:val="24"/>
+              </w:rPr>
+            </w:pPr>
+            <w:r>
+              <w:rPr>
+                <w:b w:val="1"/>
+                <w:bCs w:val="1"/>
+                <w:sz w:val="24"/>
+                <w:szCs w:val="24"/>
+                <w:rtl w:val="0"/>
+              </w:rPr>
+              <w:t xml:space="preserve">Resumo: </w:t>
+            </w:r>
+          </w:p>
+        </w:tc>
+        <w:tc>
+          <w:tcPr>
+            <w:shd w:fill="auto" w:val="clear"/>
+            <w:tcMar>
+              <w:top w:w="100.0" w:type="dxa"/>
+              <w:left w:w="100.0" w:type="dxa"/>
+              <w:bottom w:w="100.0" w:type="dxa"/>
+              <w:right w:w="100.0" w:type="dxa"/>
+            </w:tcMar>
+            <w:vAlign w:val="top"/>
+          </w:tcPr>
+          <w:p>
+            <w:pPr>
+              <w:rPr/>
+            </w:pPr>
+            <w:r>
+              <w:rPr>
+                <w:rtl w:val="0"/>
+              </w:rPr>
+              <w:t xml:space="preserve"> O usuário realiza o cadastro e autenticação na plataforma para criar sua conta, configurando seu perfil de gastos. O sistema valida automaticamente a idade (maiores de 18 anos) e libera a criação de viagens independentes. O sistema permite cadastro e login com nome, e-mail e senha. O usuário pode criar, editar ou cancelar viagem. O viajante registra gastos em categorias como transporte, hospedagem, alimentação e passeios. O sistema calcula automaticamente o custo por categoria e o total da viagem. O sistema permite escolher o tipo de viagem (lazer ou negócios).</w:t>
+            </w:r>
+          </w:p>
+          <w:p>
+            <w:pPr>
+              <w:rPr/>
+            </w:pPr>
+            <w:r>
+              <w:rPr>
+                <w:rtl w:val="0"/>
+              </w:rPr>
+            </w:r>
+          </w:p>
+          <w:p>
+            <w:pPr>
+              <w:widowControl w:val="0"/>
+              <w:spacing w:line="240" w:lineRule="auto"/>
+              <w:rPr>
+                <w:sz w:val="24"/>
+                <w:szCs w:val="24"/>
+              </w:rPr>
+            </w:pPr>
+            <w:r>
+              <w:rPr>
+                <w:rtl w:val="0"/>
+              </w:rPr>
+            </w:r>
+          </w:p>
+        </w:tc>
+      </w:tr>
+      <w:tr>
+        <w:trPr>
+          <w:cantSplit w:val="0"/>
+          <w:tblHeader w:val="0"/>
+        </w:trPr>
+        <w:tc>
+          <w:tcPr>
+            <w:shd w:fill="999999" w:val="clear"/>
+            <w:tcMar>
+              <w:top w:w="100.0" w:type="dxa"/>
+              <w:left w:w="100.0" w:type="dxa"/>
+              <w:bottom w:w="100.0" w:type="dxa"/>
+              <w:right w:w="100.0" w:type="dxa"/>
+            </w:tcMar>
+            <w:vAlign w:val="top"/>
+          </w:tcPr>
+          <w:p>
+            <w:pPr>
+              <w:widowControl w:val="0"/>
+              <w:spacing w:line="240" w:lineRule="auto"/>
+              <w:rPr>
+                <w:b w:val="1"/>
+                <w:bCs w:val="1"/>
+                <w:sz w:val="24"/>
+                <w:szCs w:val="24"/>
+              </w:rPr>
+            </w:pPr>
+            <w:r>
+              <w:rPr>
+                <w:b w:val="1"/>
+                <w:bCs w:val="1"/>
+                <w:sz w:val="24"/>
+                <w:szCs w:val="24"/>
+                <w:rtl w:val="0"/>
+              </w:rPr>
+              <w:t xml:space="preserve">Pré-condições: </w:t>
+            </w:r>
+          </w:p>
+        </w:tc>
+        <w:tc>
+          <w:tcPr>
+            <w:shd w:fill="auto" w:val="clear"/>
+            <w:tcMar>
+              <w:top w:w="100.0" w:type="dxa"/>
+              <w:left w:w="100.0" w:type="dxa"/>
+              <w:bottom w:w="100.0" w:type="dxa"/>
+              <w:right w:w="100.0" w:type="dxa"/>
+            </w:tcMar>
+            <w:vAlign w:val="top"/>
+          </w:tcPr>
+          <w:p>
+            <w:pPr>
+              <w:numPr>
+                <w:ilvl w:val="0"/>
+                <w:numId w:val="3"/>
+              </w:numPr>
+              <w:ind w:left="720" w:hanging="360"/>
+              <w:rPr>
+                <w:u w:val="none"/>
+              </w:rPr>
+            </w:pPr>
+            <w:r>
+              <w:rPr>
+                <w:rtl w:val="0"/>
+              </w:rPr>
+              <w:t xml:space="preserve"> O usuário acessou a tela de registro e está logado.</w:t>
+            </w:r>
+          </w:p>
+          <w:p>
+            <w:pPr>
+              <w:numPr>
+                <w:ilvl w:val="0"/>
+                <w:numId w:val="3"/>
+              </w:numPr>
+              <w:ind w:left="720" w:hanging="360"/>
+              <w:rPr>
+                <w:u w:val="none"/>
+              </w:rPr>
+            </w:pPr>
+            <w:r>
+              <w:rPr>
+                <w:rtl w:val="0"/>
+              </w:rPr>
+              <w:t xml:space="preserve"> O e-mail e senha são informados corretamente.</w:t>
+            </w:r>
+          </w:p>
+          <w:p>
+            <w:pPr>
+              <w:numPr>
+                <w:ilvl w:val="0"/>
+                <w:numId w:val="3"/>
+              </w:numPr>
+              <w:ind w:left="720" w:hanging="360"/>
+              <w:rPr>
+                <w:u w:val="none"/>
+              </w:rPr>
+            </w:pPr>
+            <w:r>
+              <w:rPr>
+                <w:rtl w:val="0"/>
+              </w:rPr>
+              <w:t xml:space="preserve">A data de nascimento está cadastrada.</w:t>
+            </w:r>
+          </w:p>
+          <w:p>
+            <w:pPr>
+              <w:numPr>
+                <w:ilvl w:val="0"/>
+                <w:numId w:val="3"/>
+              </w:numPr>
+              <w:ind w:left="720" w:hanging="360"/>
+              <w:rPr>
+                <w:u w:val="none"/>
+              </w:rPr>
+            </w:pPr>
+            <w:r>
+              <w:rPr>
+                <w:rtl w:val="0"/>
+              </w:rPr>
+              <w:t xml:space="preserve">O usuário acessou a tela de criação de viagem e tem uma viagem selecionada.</w:t>
+            </w:r>
+          </w:p>
+          <w:p>
+            <w:pPr>
+              <w:numPr>
+                <w:ilvl w:val="0"/>
+                <w:numId w:val="3"/>
+              </w:numPr>
+              <w:ind w:left="720" w:hanging="360"/>
+              <w:rPr>
+                <w:u w:val="none"/>
+              </w:rPr>
+            </w:pPr>
+            <w:r>
+              <w:rPr>
+                <w:rtl w:val="0"/>
+              </w:rPr>
+              <w:t xml:space="preserve">O usuário acessou a aba "Gastos" ou "Configurações"</w:t>
+            </w:r>
+            <w:r>
+              <w:rPr>
+                <w:rtl w:val="0"/>
+              </w:rPr>
+            </w:r>
+          </w:p>
+        </w:tc>
+      </w:tr>
+      <w:tr>
+        <w:trPr>
+          <w:cantSplit w:val="0"/>
+          <w:tblHeader w:val="0"/>
+        </w:trPr>
+        <w:tc>
+          <w:tcPr>
+            <w:shd w:fill="999999" w:val="clear"/>
+            <w:tcMar>
+              <w:top w:w="100.0" w:type="dxa"/>
+              <w:left w:w="100.0" w:type="dxa"/>
+              <w:bottom w:w="100.0" w:type="dxa"/>
+              <w:right w:w="100.0" w:type="dxa"/>
+            </w:tcMar>
+            <w:vAlign w:val="top"/>
+          </w:tcPr>
+          <w:p>
+            <w:pPr>
+              <w:widowControl w:val="0"/>
+              <w:spacing w:line="240" w:lineRule="auto"/>
+              <w:rPr>
+                <w:b w:val="1"/>
+                <w:bCs w:val="1"/>
+                <w:sz w:val="24"/>
+                <w:szCs w:val="24"/>
+              </w:rPr>
+            </w:pPr>
+            <w:r>
+              <w:rPr>
+                <w:b w:val="1"/>
+                <w:bCs w:val="1"/>
+                <w:sz w:val="24"/>
+                <w:szCs w:val="24"/>
+                <w:rtl w:val="0"/>
+              </w:rPr>
+              <w:t xml:space="preserve">Pós-condições: </w:t>
+            </w:r>
+          </w:p>
+        </w:tc>
+        <w:tc>
+          <w:tcPr>
+            <w:shd w:fill="auto" w:val="clear"/>
+            <w:tcMar>
+              <w:top w:w="100.0" w:type="dxa"/>
+              <w:left w:w="100.0" w:type="dxa"/>
+              <w:bottom w:w="100.0" w:type="dxa"/>
+              <w:right w:w="100.0" w:type="dxa"/>
+            </w:tcMar>
+            <w:vAlign w:val="top"/>
+          </w:tcPr>
+          <w:p>
+            <w:pPr>
+              <w:widowControl w:val="0"/>
+              <w:spacing w:line="240" w:lineRule="auto"/>
+              <w:rPr>
+                <w:sz w:val="24"/>
+                <w:szCs w:val="24"/>
+              </w:rPr>
+            </w:pPr>
+            <w:r>
+              <w:rPr>
+                <w:rtl w:val="0"/>
+              </w:rPr>
+            </w:r>
+          </w:p>
+        </w:tc>
+      </w:tr>
+      <w:tr>
+        <w:trPr>
+          <w:cantSplit w:val="0"/>
+          <w:tblHeader w:val="0"/>
+        </w:trPr>
+        <w:tc>
+          <w:tcPr>
+            <w:shd w:fill="999999" w:val="clear"/>
+            <w:tcMar>
+              <w:top w:w="100.0" w:type="dxa"/>
+              <w:left w:w="100.0" w:type="dxa"/>
+              <w:bottom w:w="100.0" w:type="dxa"/>
+              <w:right w:w="100.0" w:type="dxa"/>
+            </w:tcMar>
+            <w:vAlign w:val="top"/>
+          </w:tcPr>
+          <w:p>
+            <w:pPr>
+              <w:widowControl w:val="0"/>
+              <w:spacing w:line="240" w:lineRule="auto"/>
+              <w:rPr>
+                <w:b w:val="1"/>
+                <w:bCs w:val="1"/>
+                <w:sz w:val="24"/>
+                <w:szCs w:val="24"/>
+              </w:rPr>
+            </w:pPr>
+            <w:r>
+              <w:rPr>
+                <w:b w:val="1"/>
+                <w:bCs w:val="1"/>
+                <w:sz w:val="24"/>
+                <w:szCs w:val="24"/>
+                <w:rtl w:val="0"/>
+              </w:rPr>
+              <w:t xml:space="preserve">Fluxo Principal: </w:t>
+            </w:r>
+          </w:p>
+        </w:tc>
+        <w:tc>
+          <w:tcPr>
+            <w:shd w:fill="auto" w:val="clear"/>
+            <w:tcMar>
+              <w:top w:w="100.0" w:type="dxa"/>
+              <w:left w:w="100.0" w:type="dxa"/>
+              <w:bottom w:w="100.0" w:type="dxa"/>
+              <w:right w:w="100.0" w:type="dxa"/>
+            </w:tcMar>
+            <w:vAlign w:val="top"/>
+          </w:tcPr>
+          <w:p>
+            <w:pPr>
+              <w:widowControl w:val="0"/>
+              <w:spacing w:line="240" w:lineRule="auto"/>
+              <w:rPr>
+                <w:sz w:val="24"/>
+                <w:szCs w:val="24"/>
+              </w:rPr>
+            </w:pPr>
+            <w:r>
+              <w:rPr>
+                <w:rtl w:val="0"/>
+              </w:rPr>
+            </w:r>
+          </w:p>
+        </w:tc>
+      </w:tr>
+      <w:tr>
+        <w:trPr>
+          <w:cantSplit w:val="0"/>
+          <w:tblHeader w:val="0"/>
+        </w:trPr>
+        <w:tc>
+          <w:tcPr>
+            <w:shd w:fill="999999" w:val="clear"/>
+            <w:tcMar>
+              <w:top w:w="100.0" w:type="dxa"/>
+              <w:left w:w="100.0" w:type="dxa"/>
+              <w:bottom w:w="100.0" w:type="dxa"/>
+              <w:right w:w="100.0" w:type="dxa"/>
+            </w:tcMar>
+            <w:vAlign w:val="top"/>
+          </w:tcPr>
+          <w:p>
+            <w:pPr>
+              <w:widowControl w:val="0"/>
+              <w:spacing w:line="240" w:lineRule="auto"/>
+              <w:rPr>
+                <w:b w:val="1"/>
+                <w:bCs w:val="1"/>
+                <w:sz w:val="24"/>
+                <w:szCs w:val="24"/>
+              </w:rPr>
+            </w:pPr>
+            <w:r>
+              <w:rPr>
+                <w:b w:val="1"/>
+                <w:bCs w:val="1"/>
+                <w:sz w:val="24"/>
+                <w:szCs w:val="24"/>
+                <w:rtl w:val="0"/>
+              </w:rPr>
+              <w:t xml:space="preserve">Fluxos Alternativos: </w:t>
+            </w:r>
+          </w:p>
+        </w:tc>
+        <w:tc>
+          <w:tcPr>
+            <w:shd w:fill="auto" w:val="clear"/>
+            <w:tcMar>
+              <w:top w:w="100.0" w:type="dxa"/>
+              <w:left w:w="100.0" w:type="dxa"/>
+              <w:bottom w:w="100.0" w:type="dxa"/>
+              <w:right w:w="100.0" w:type="dxa"/>
+            </w:tcMar>
+            <w:vAlign w:val="top"/>
+          </w:tcPr>
+          <w:p>
+            <w:pPr>
+              <w:widowControl w:val="0"/>
+              <w:spacing w:line="240" w:lineRule="auto"/>
+              <w:rPr>
+                <w:b w:val="1"/>
+                <w:bCs w:val="1"/>
+                <w:sz w:val="24"/>
+                <w:szCs w:val="24"/>
+              </w:rPr>
+            </w:pPr>
+            <w:r>
+              <w:rPr>
+                <w:b w:val="1"/>
+                <w:bCs w:val="1"/>
+                <w:sz w:val="24"/>
+                <w:szCs w:val="24"/>
+                <w:rtl w:val="0"/>
+              </w:rPr>
+              <w:t xml:space="preserve">FA01 - Aplicação de Frete Grátis:</w:t>
+            </w:r>
+          </w:p>
+          <w:p>
+            <w:pPr>
+              <w:widowControl w:val="0"/>
+              <w:spacing w:line="240" w:lineRule="auto"/>
+              <w:rPr>
+                <w:sz w:val="24"/>
+                <w:szCs w:val="24"/>
+              </w:rPr>
+            </w:pPr>
+            <w:r>
+              <w:rPr>
+                <w:rtl w:val="0"/>
+              </w:rPr>
+            </w:r>
+          </w:p>
+          <w:p>
+            <w:pPr>
+              <w:widowControl w:val="0"/>
+              <w:numPr>
+                <w:ilvl w:val="0"/>
+                <w:numId w:val="4"/>
+              </w:numPr>
+              <w:spacing w:line="240" w:lineRule="auto"/>
+              <w:ind w:left="720" w:hanging="360"/>
+              <w:rPr>
+                <w:sz w:val="24"/>
+                <w:szCs w:val="24"/>
+              </w:rPr>
+            </w:pPr>
+            <w:r>
+              <w:rPr>
+                <w:b w:val="1"/>
+                <w:bCs w:val="1"/>
+                <w:sz w:val="24"/>
+                <w:szCs w:val="24"/>
+                <w:rtl w:val="0"/>
+              </w:rPr>
+              <w:t xml:space="preserve">3a.</w:t>
+            </w:r>
+            <w:r>
+              <w:rPr>
+                <w:sz w:val="24"/>
+                <w:szCs w:val="24"/>
+                <w:rtl w:val="0"/>
+              </w:rPr>
+              <w:t xml:space="preserve"> O sistema identifica que o CEP pertence à mesma região metropolitana do CD ou que o cliente é membro ativo do programa de fidelidade. </w:t>
+            </w:r>
+          </w:p>
+          <w:p>
+            <w:pPr>
+              <w:widowControl w:val="0"/>
+              <w:spacing w:line="240" w:lineRule="auto"/>
+              <w:ind w:left="720" w:firstLine="0"/>
+              <w:rPr>
+                <w:sz w:val="24"/>
+                <w:szCs w:val="24"/>
+              </w:rPr>
+            </w:pPr>
+            <w:r>
+              <w:rPr>
+                <w:rtl w:val="0"/>
+              </w:rPr>
+            </w:r>
+          </w:p>
+          <w:p>
+            <w:pPr>
+              <w:widowControl w:val="0"/>
+              <w:numPr>
+                <w:ilvl w:val="0"/>
+                <w:numId w:val="4"/>
+              </w:numPr>
+              <w:spacing w:line="240" w:lineRule="auto"/>
+              <w:ind w:left="720" w:hanging="360"/>
+              <w:rPr>
+                <w:sz w:val="24"/>
+                <w:szCs w:val="24"/>
+              </w:rPr>
+            </w:pPr>
+            <w:r>
+              <w:rPr>
+                <w:b w:val="1"/>
+                <w:bCs w:val="1"/>
+                <w:sz w:val="24"/>
+                <w:szCs w:val="24"/>
+                <w:rtl w:val="0"/>
+              </w:rPr>
+              <w:t xml:space="preserve">3b.</w:t>
+            </w:r>
+            <w:r>
+              <w:rPr>
+                <w:sz w:val="24"/>
+                <w:szCs w:val="24"/>
+                <w:rtl w:val="0"/>
+              </w:rPr>
+              <w:t xml:space="preserve"> O sistema aplica isenção total de frete (R$ 0,00) ao carrinho. </w:t>
+            </w:r>
+          </w:p>
+          <w:p>
+            <w:pPr>
+              <w:widowControl w:val="0"/>
+              <w:spacing w:line="240" w:lineRule="auto"/>
+              <w:rPr>
+                <w:sz w:val="24"/>
+                <w:szCs w:val="24"/>
+              </w:rPr>
+            </w:pPr>
+            <w:r>
+              <w:rPr>
+                <w:rtl w:val="0"/>
+              </w:rPr>
+            </w:r>
+          </w:p>
+        </w:tc>
+      </w:tr>
+      <w:tr>
+        <w:trPr>
+          <w:cantSplit w:val="0"/>
+          <w:tblHeader w:val="0"/>
+        </w:trPr>
+        <w:tc>
+          <w:tcPr>
+            <w:shd w:fill="999999" w:val="clear"/>
+            <w:tcMar>
+              <w:top w:w="100.0" w:type="dxa"/>
+              <w:left w:w="100.0" w:type="dxa"/>
+              <w:bottom w:w="100.0" w:type="dxa"/>
+              <w:right w:w="100.0" w:type="dxa"/>
+            </w:tcMar>
+            <w:vAlign w:val="top"/>
+          </w:tcPr>
+          <w:p>
+            <w:pPr>
+              <w:widowControl w:val="0"/>
+              <w:spacing w:line="240" w:lineRule="auto"/>
+              <w:rPr>
+                <w:b w:val="1"/>
+                <w:bCs w:val="1"/>
+                <w:sz w:val="24"/>
+                <w:szCs w:val="24"/>
+              </w:rPr>
+            </w:pPr>
+            <w:r>
+              <w:rPr>
+                <w:b w:val="1"/>
+                <w:bCs w:val="1"/>
+                <w:sz w:val="24"/>
+                <w:szCs w:val="24"/>
+                <w:rtl w:val="0"/>
+              </w:rPr>
+              <w:t xml:space="preserve">Fluxos de Exceção: </w:t>
+            </w:r>
+          </w:p>
+        </w:tc>
+        <w:tc>
+          <w:tcPr>
+            <w:shd w:fill="auto" w:val="clear"/>
+            <w:tcMar>
+              <w:top w:w="100.0" w:type="dxa"/>
+              <w:left w:w="100.0" w:type="dxa"/>
+              <w:bottom w:w="100.0" w:type="dxa"/>
+              <w:right w:w="100.0" w:type="dxa"/>
+            </w:tcMar>
+            <w:vAlign w:val="top"/>
+          </w:tcPr>
+          <w:p>
+            <w:pPr>
+              <w:widowControl w:val="0"/>
+              <w:spacing w:line="240" w:lineRule="auto"/>
+              <w:rPr>
+                <w:b w:val="1"/>
+                <w:bCs w:val="1"/>
+                <w:sz w:val="24"/>
+                <w:szCs w:val="24"/>
+              </w:rPr>
+            </w:pPr>
+            <w:r>
+              <w:rPr>
+                <w:b w:val="1"/>
+                <w:bCs w:val="1"/>
+                <w:sz w:val="24"/>
+                <w:szCs w:val="24"/>
+                <w:rtl w:val="0"/>
+              </w:rPr>
+              <w:t xml:space="preserve">FE01 - Indisponibilidade na API da Transportadora:</w:t>
+            </w:r>
+          </w:p>
+          <w:p>
+            <w:pPr>
+              <w:widowControl w:val="0"/>
+              <w:spacing w:line="240" w:lineRule="auto"/>
+              <w:rPr>
+                <w:sz w:val="24"/>
+                <w:szCs w:val="24"/>
+              </w:rPr>
+            </w:pPr>
+            <w:r>
+              <w:rPr>
+                <w:rtl w:val="0"/>
+              </w:rPr>
+            </w:r>
+          </w:p>
+          <w:p>
+            <w:pPr>
+              <w:widowControl w:val="0"/>
+              <w:numPr>
+                <w:ilvl w:val="0"/>
+                <w:numId w:val="2"/>
+              </w:numPr>
+              <w:spacing w:line="240" w:lineRule="auto"/>
+              <w:ind w:left="720" w:hanging="360"/>
+              <w:rPr>
+                <w:sz w:val="24"/>
+                <w:szCs w:val="24"/>
+              </w:rPr>
+            </w:pPr>
+            <w:r>
+              <w:rPr>
+                <w:b w:val="1"/>
+                <w:bCs w:val="1"/>
+                <w:sz w:val="24"/>
+                <w:szCs w:val="24"/>
+                <w:rtl w:val="0"/>
+              </w:rPr>
+              <w:t xml:space="preserve">2a.</w:t>
+            </w:r>
+            <w:r>
+              <w:rPr>
+                <w:sz w:val="24"/>
+                <w:szCs w:val="24"/>
+                <w:rtl w:val="0"/>
+              </w:rPr>
+              <w:t xml:space="preserve"> A API de cálculo da transportadora não responde no tempo limite. </w:t>
+            </w:r>
+          </w:p>
+          <w:p>
+            <w:pPr>
+              <w:widowControl w:val="0"/>
+              <w:spacing w:line="240" w:lineRule="auto"/>
+              <w:ind w:left="720" w:firstLine="0"/>
+              <w:rPr>
+                <w:sz w:val="24"/>
+                <w:szCs w:val="24"/>
+              </w:rPr>
+            </w:pPr>
+            <w:r>
+              <w:rPr>
+                <w:rtl w:val="0"/>
+              </w:rPr>
+            </w:r>
+          </w:p>
+          <w:p>
+            <w:pPr>
+              <w:widowControl w:val="0"/>
+              <w:numPr>
+                <w:ilvl w:val="0"/>
+                <w:numId w:val="2"/>
+              </w:numPr>
+              <w:spacing w:line="240" w:lineRule="auto"/>
+              <w:ind w:left="720" w:hanging="360"/>
+              <w:rPr>
+                <w:sz w:val="24"/>
+                <w:szCs w:val="24"/>
+              </w:rPr>
+            </w:pPr>
+            <w:r>
+              <w:rPr>
+                <w:b w:val="1"/>
+                <w:bCs w:val="1"/>
+                <w:sz w:val="24"/>
+                <w:szCs w:val="24"/>
+                <w:rtl w:val="0"/>
+              </w:rPr>
+              <w:t xml:space="preserve">2b.</w:t>
+            </w:r>
+            <w:r>
+              <w:rPr>
+                <w:sz w:val="24"/>
+                <w:szCs w:val="24"/>
+                <w:rtl w:val="0"/>
+              </w:rPr>
+              <w:t xml:space="preserve"> O sistema utiliza a tabela de contingência offline de frete estimado e exibe aviso ao usuário. (Pode ter alteração no valor - Deve ser consultado posteriormente)</w:t>
+            </w:r>
+          </w:p>
+        </w:tc>
+      </w:tr>
+      <w:tr>
+        <w:trPr>
+          <w:cantSplit w:val="0"/>
+          <w:tblHeader w:val="0"/>
+        </w:trPr>
+        <w:tc>
+          <w:tcPr>
+            <w:shd w:fill="999999" w:val="clear"/>
+            <w:tcMar>
+              <w:top w:w="100.0" w:type="dxa"/>
+              <w:left w:w="100.0" w:type="dxa"/>
+              <w:bottom w:w="100.0" w:type="dxa"/>
+              <w:right w:w="100.0" w:type="dxa"/>
+            </w:tcMar>
+            <w:vAlign w:val="top"/>
+          </w:tcPr>
+          <w:p>
+            <w:pPr>
+              <w:widowControl w:val="0"/>
+              <w:spacing w:line="240" w:lineRule="auto"/>
+              <w:rPr>
+                <w:b w:val="1"/>
+                <w:bCs w:val="1"/>
+                <w:sz w:val="24"/>
+                <w:szCs w:val="24"/>
+              </w:rPr>
+            </w:pPr>
+            <w:r>
+              <w:rPr>
+                <w:b w:val="1"/>
+                <w:bCs w:val="1"/>
+                <w:sz w:val="24"/>
+                <w:szCs w:val="24"/>
+                <w:rtl w:val="0"/>
+              </w:rPr>
+              <w:t xml:space="preserve">Relações de Regras de Negócio: </w:t>
+            </w:r>
+          </w:p>
+        </w:tc>
+        <w:tc>
+          <w:tcPr>
+            <w:shd w:fill="auto" w:val="clear"/>
+            <w:tcMar>
+              <w:top w:w="100.0" w:type="dxa"/>
+              <w:left w:w="100.0" w:type="dxa"/>
+              <w:bottom w:w="100.0" w:type="dxa"/>
+              <w:right w:w="100.0" w:type="dxa"/>
+            </w:tcMar>
+            <w:vAlign w:val="top"/>
+          </w:tcPr>
+          <w:p>
+            <w:pPr>
+              <w:widowControl w:val="0"/>
+              <w:numPr>
+                <w:ilvl w:val="0"/>
+                <w:numId w:val="1"/>
+              </w:numPr>
+              <w:spacing w:line="240" w:lineRule="auto"/>
+              <w:ind w:left="720" w:hanging="360"/>
+              <w:rPr>
+                <w:sz w:val="24"/>
+                <w:szCs w:val="24"/>
+              </w:rPr>
+            </w:pPr>
+            <w:r>
+              <w:rPr>
+                <w:b w:val="1"/>
+                <w:bCs w:val="1"/>
+                <w:sz w:val="24"/>
+                <w:szCs w:val="24"/>
+                <w:rtl w:val="0"/>
+              </w:rPr>
+              <w:t xml:space="preserve">RN03</w:t>
+            </w:r>
+            <w:r>
+              <w:rPr>
+                <w:sz w:val="24"/>
+                <w:szCs w:val="24"/>
+                <w:rtl w:val="0"/>
+              </w:rPr>
+              <w:t xml:space="preserve"> </w:t>
+            </w:r>
+          </w:p>
+          <w:p>
+            <w:pPr>
+              <w:widowControl w:val="0"/>
+              <w:spacing w:line="240" w:lineRule="auto"/>
+              <w:ind w:left="720" w:firstLine="0"/>
+              <w:rPr>
+                <w:sz w:val="24"/>
+                <w:szCs w:val="24"/>
+              </w:rPr>
+            </w:pPr>
+            <w:r>
+              <w:rPr>
+                <w:rtl w:val="0"/>
+              </w:rPr>
+            </w:r>
+          </w:p>
+          <w:p>
+            <w:pPr>
+              <w:widowControl w:val="0"/>
+              <w:numPr>
+                <w:ilvl w:val="0"/>
+                <w:numId w:val="1"/>
+              </w:numPr>
+              <w:spacing w:line="240" w:lineRule="auto"/>
+              <w:ind w:left="720" w:hanging="360"/>
+              <w:rPr>
+                <w:b w:val="1"/>
+                <w:bCs w:val="1"/>
+                <w:sz w:val="24"/>
+                <w:szCs w:val="24"/>
+              </w:rPr>
+            </w:pPr>
+            <w:r>
+              <w:rPr>
+                <w:b w:val="1"/>
+                <w:bCs w:val="1"/>
+                <w:sz w:val="24"/>
+                <w:szCs w:val="24"/>
+                <w:rtl w:val="0"/>
+              </w:rPr>
+              <w:t xml:space="preserve">RF02 </w:t>
+            </w:r>
+          </w:p>
+        </w:tc>
+      </w:tr>
+    </w:tbl>
     <w:p>
       <w:pPr>
         <w:spacing w:line="360" w:lineRule="auto"/>
@@ -8038,11 +9149,11 @@
       <w:pPr>
         <w:spacing w:line="360" w:lineRule="auto"/>
         <w:jc w:val="both"/>
-        <w:rPr/>
-      </w:pPr>
-      <w:r>
-        <w:br w:type="page"/>
-      </w:r>
+        <w:rPr>
+          <w:sz w:val="24"/>
+          <w:szCs w:val="24"/>
+        </w:rPr>
+      </w:pPr>
       <w:r>
         <w:rPr>
           <w:rtl w:val="0"/>
@@ -8051,8 +9162,21 @@
     </w:p>
     <w:p>
       <w:pPr>
-        <w:spacing w:line="360" w:lineRule="auto"/>
-        <w:jc w:val="both"/>
+        <w:keepNext w:val="0"/>
+        <w:keepLines w:val="0"/>
+        <w:pageBreakBefore w:val="0"/>
+        <w:widowControl w:val="0"/>
+        <w:pBdr>
+          <w:top w:space="0" w:sz="0" w:val="nil"/>
+          <w:left w:space="0" w:sz="0" w:val="nil"/>
+          <w:bottom w:space="0" w:sz="0" w:val="nil"/>
+          <w:right w:space="0" w:sz="0" w:val="nil"/>
+          <w:between w:space="0" w:sz="0" w:val="nil"/>
+        </w:pBdr>
+        <w:shd w:fill="auto" w:val="clear"/>
+        <w:spacing w:after="0" w:before="0" w:line="276" w:lineRule="auto"/>
+        <w:ind w:left="0" w:right="0" w:firstLine="0"/>
+        <w:jc w:val="left"/>
         <w:rPr/>
       </w:pPr>
       <w:r>
@@ -8065,6 +9189,9 @@
       <w:type w:val="continuous"/>
       <w:pgSz w:h="11920" w:w="16840" w:orient="landscape"/>
       <w:pgMar w:bottom="0" w:top="1683.7795275590554" w:left="1440.0000000000002" w:right="1440.0000000000002" w:header="0" w:footer="720"/>
+      <w:cols w:equalWidth="0" w:num="1">
+        <w:col w:space="0" w:w="13957.78"/>
+      </w:cols>
     </w:sectPr>
   </w:body>
 </w:document>
@@ -8086,7 +9213,460 @@
 </file>
 
 <file path=word/numbering.xml><?xml version="1.0" encoding="utf-8"?>
-<w:numbering xmlns:mc="http://schemas.openxmlformats.org/markup-compatibility/2006" xmlns:o="urn:schemas-microsoft-com:office:office" xmlns:r="http://schemas.openxmlformats.org/officeDocument/2006/relationships" xmlns:m="http://schemas.openxmlformats.org/officeDocument/2006/math" xmlns:v="urn:schemas-microsoft-com:vml" xmlns:wp="http://schemas.openxmlformats.org/drawingml/2006/wordprocessingDrawing" xmlns:w10="urn:schemas-microsoft-com:office:word" xmlns:w="http://schemas.openxmlformats.org/wordprocessingml/2006/main" xmlns:wne="http://schemas.microsoft.com/office/word/2006/wordml" xmlns:sl="http://schemas.openxmlformats.org/schemaLibrary/2006/main" xmlns:a="http://schemas.openxmlformats.org/drawingml/2006/main" xmlns:pic="http://schemas.openxmlformats.org/drawingml/2006/picture" xmlns:c="http://schemas.openxmlformats.org/drawingml/2006/chart" xmlns:lc="http://schemas.openxmlformats.org/drawingml/2006/lockedCanvas" xmlns:dgm="http://schemas.openxmlformats.org/drawingml/2006/diagram" xmlns:wps="http://schemas.microsoft.com/office/word/2010/wordprocessingShape" xmlns:wpg="http://schemas.microsoft.com/office/word/2010/wordprocessingGroup" xmlns:w14="http://schemas.microsoft.com/office/word/2010/wordml" xmlns:w15="http://schemas.microsoft.com/office/word/2012/wordml" xmlns:w16="http://schemas.microsoft.com/office/word/2018/wordml" xmlns:w16cex="http://schemas.microsoft.com/office/word/2018/wordml/cex" xmlns:w16cid="http://schemas.microsoft.com/office/word/2016/wordml/cid" xmlns="http://schemas.microsoft.com/office/tasks/2019/documenttasks" xmlns:cr="http://schemas.microsoft.com/office/comments/2020/reactions"/>
+<w:numbering xmlns:mc="http://schemas.openxmlformats.org/markup-compatibility/2006" xmlns:o="urn:schemas-microsoft-com:office:office" xmlns:r="http://schemas.openxmlformats.org/officeDocument/2006/relationships" xmlns:m="http://schemas.openxmlformats.org/officeDocument/2006/math" xmlns:v="urn:schemas-microsoft-com:vml" xmlns:wp="http://schemas.openxmlformats.org/drawingml/2006/wordprocessingDrawing" xmlns:w10="urn:schemas-microsoft-com:office:word" xmlns:w="http://schemas.openxmlformats.org/wordprocessingml/2006/main" xmlns:wne="http://schemas.microsoft.com/office/word/2006/wordml" xmlns:sl="http://schemas.openxmlformats.org/schemaLibrary/2006/main" xmlns:a="http://schemas.openxmlformats.org/drawingml/2006/main" xmlns:pic="http://schemas.openxmlformats.org/drawingml/2006/picture" xmlns:c="http://schemas.openxmlformats.org/drawingml/2006/chart" xmlns:lc="http://schemas.openxmlformats.org/drawingml/2006/lockedCanvas" xmlns:dgm="http://schemas.openxmlformats.org/drawingml/2006/diagram" xmlns:wps="http://schemas.microsoft.com/office/word/2010/wordprocessingShape" xmlns:wpg="http://schemas.microsoft.com/office/word/2010/wordprocessingGroup" xmlns:w14="http://schemas.microsoft.com/office/word/2010/wordml" xmlns:w15="http://schemas.microsoft.com/office/word/2012/wordml" xmlns:w16="http://schemas.microsoft.com/office/word/2018/wordml" xmlns:w16cex="http://schemas.microsoft.com/office/word/2018/wordml/cex" xmlns:w16cid="http://schemas.microsoft.com/office/word/2016/wordml/cid" xmlns="http://schemas.microsoft.com/office/tasks/2019/documenttasks" xmlns:cr="http://schemas.microsoft.com/office/comments/2020/reactions">
+  <w:abstractNum w:abstractNumId="1">
+    <w:lvl w:ilvl="0">
+      <w:start w:val="1"/>
+      <w:numFmt w:val="bullet"/>
+      <w:lvlText w:val="●"/>
+      <w:lvlJc w:val="left"/>
+      <w:pPr>
+        <w:ind w:left="720" w:hanging="360"/>
+      </w:pPr>
+      <w:rPr>
+        <w:u w:val="none"/>
+      </w:rPr>
+    </w:lvl>
+    <w:lvl w:ilvl="1">
+      <w:start w:val="1"/>
+      <w:numFmt w:val="bullet"/>
+      <w:lvlText w:val="○"/>
+      <w:lvlJc w:val="left"/>
+      <w:pPr>
+        <w:ind w:left="1440" w:hanging="360"/>
+      </w:pPr>
+      <w:rPr>
+        <w:u w:val="none"/>
+      </w:rPr>
+    </w:lvl>
+    <w:lvl w:ilvl="2">
+      <w:start w:val="1"/>
+      <w:numFmt w:val="bullet"/>
+      <w:lvlText w:val="■"/>
+      <w:lvlJc w:val="left"/>
+      <w:pPr>
+        <w:ind w:left="2160" w:hanging="360"/>
+      </w:pPr>
+      <w:rPr>
+        <w:u w:val="none"/>
+      </w:rPr>
+    </w:lvl>
+    <w:lvl w:ilvl="3">
+      <w:start w:val="1"/>
+      <w:numFmt w:val="bullet"/>
+      <w:lvlText w:val="●"/>
+      <w:lvlJc w:val="left"/>
+      <w:pPr>
+        <w:ind w:left="2880" w:hanging="360"/>
+      </w:pPr>
+      <w:rPr>
+        <w:u w:val="none"/>
+      </w:rPr>
+    </w:lvl>
+    <w:lvl w:ilvl="4">
+      <w:start w:val="1"/>
+      <w:numFmt w:val="bullet"/>
+      <w:lvlText w:val="○"/>
+      <w:lvlJc w:val="left"/>
+      <w:pPr>
+        <w:ind w:left="3600" w:hanging="360"/>
+      </w:pPr>
+      <w:rPr>
+        <w:u w:val="none"/>
+      </w:rPr>
+    </w:lvl>
+    <w:lvl w:ilvl="5">
+      <w:start w:val="1"/>
+      <w:numFmt w:val="bullet"/>
+      <w:lvlText w:val="■"/>
+      <w:lvlJc w:val="left"/>
+      <w:pPr>
+        <w:ind w:left="4320" w:hanging="360"/>
+      </w:pPr>
+      <w:rPr>
+        <w:u w:val="none"/>
+      </w:rPr>
+    </w:lvl>
+    <w:lvl w:ilvl="6">
+      <w:start w:val="1"/>
+      <w:numFmt w:val="bullet"/>
+      <w:lvlText w:val="●"/>
+      <w:lvlJc w:val="left"/>
+      <w:pPr>
+        <w:ind w:left="5040" w:hanging="360"/>
+      </w:pPr>
+      <w:rPr>
+        <w:u w:val="none"/>
+      </w:rPr>
+    </w:lvl>
+    <w:lvl w:ilvl="7">
+      <w:start w:val="1"/>
+      <w:numFmt w:val="bullet"/>
+      <w:lvlText w:val="○"/>
+      <w:lvlJc w:val="left"/>
+      <w:pPr>
+        <w:ind w:left="5760" w:hanging="360"/>
+      </w:pPr>
+      <w:rPr>
+        <w:u w:val="none"/>
+      </w:rPr>
+    </w:lvl>
+    <w:lvl w:ilvl="8">
+      <w:start w:val="1"/>
+      <w:numFmt w:val="bullet"/>
+      <w:lvlText w:val="■"/>
+      <w:lvlJc w:val="left"/>
+      <w:pPr>
+        <w:ind w:left="6480" w:hanging="360"/>
+      </w:pPr>
+      <w:rPr>
+        <w:u w:val="none"/>
+      </w:rPr>
+    </w:lvl>
+  </w:abstractNum>
+  <w:abstractNum w:abstractNumId="2">
+    <w:lvl w:ilvl="0">
+      <w:start w:val="1"/>
+      <w:numFmt w:val="bullet"/>
+      <w:lvlText w:val="●"/>
+      <w:lvlJc w:val="left"/>
+      <w:pPr>
+        <w:ind w:left="720" w:hanging="360"/>
+      </w:pPr>
+      <w:rPr>
+        <w:u w:val="none"/>
+      </w:rPr>
+    </w:lvl>
+    <w:lvl w:ilvl="1">
+      <w:start w:val="1"/>
+      <w:numFmt w:val="bullet"/>
+      <w:lvlText w:val="○"/>
+      <w:lvlJc w:val="left"/>
+      <w:pPr>
+        <w:ind w:left="1440" w:hanging="360"/>
+      </w:pPr>
+      <w:rPr>
+        <w:u w:val="none"/>
+      </w:rPr>
+    </w:lvl>
+    <w:lvl w:ilvl="2">
+      <w:start w:val="1"/>
+      <w:numFmt w:val="bullet"/>
+      <w:lvlText w:val="■"/>
+      <w:lvlJc w:val="left"/>
+      <w:pPr>
+        <w:ind w:left="2160" w:hanging="360"/>
+      </w:pPr>
+      <w:rPr>
+        <w:u w:val="none"/>
+      </w:rPr>
+    </w:lvl>
+    <w:lvl w:ilvl="3">
+      <w:start w:val="1"/>
+      <w:numFmt w:val="bullet"/>
+      <w:lvlText w:val="●"/>
+      <w:lvlJc w:val="left"/>
+      <w:pPr>
+        <w:ind w:left="2880" w:hanging="360"/>
+      </w:pPr>
+      <w:rPr>
+        <w:u w:val="none"/>
+      </w:rPr>
+    </w:lvl>
+    <w:lvl w:ilvl="4">
+      <w:start w:val="1"/>
+      <w:numFmt w:val="bullet"/>
+      <w:lvlText w:val="○"/>
+      <w:lvlJc w:val="left"/>
+      <w:pPr>
+        <w:ind w:left="3600" w:hanging="360"/>
+      </w:pPr>
+      <w:rPr>
+        <w:u w:val="none"/>
+      </w:rPr>
+    </w:lvl>
+    <w:lvl w:ilvl="5">
+      <w:start w:val="1"/>
+      <w:numFmt w:val="bullet"/>
+      <w:lvlText w:val="■"/>
+      <w:lvlJc w:val="left"/>
+      <w:pPr>
+        <w:ind w:left="4320" w:hanging="360"/>
+      </w:pPr>
+      <w:rPr>
+        <w:u w:val="none"/>
+      </w:rPr>
+    </w:lvl>
+    <w:lvl w:ilvl="6">
+      <w:start w:val="1"/>
+      <w:numFmt w:val="bullet"/>
+      <w:lvlText w:val="●"/>
+      <w:lvlJc w:val="left"/>
+      <w:pPr>
+        <w:ind w:left="5040" w:hanging="360"/>
+      </w:pPr>
+      <w:rPr>
+        <w:u w:val="none"/>
+      </w:rPr>
+    </w:lvl>
+    <w:lvl w:ilvl="7">
+      <w:start w:val="1"/>
+      <w:numFmt w:val="bullet"/>
+      <w:lvlText w:val="○"/>
+      <w:lvlJc w:val="left"/>
+      <w:pPr>
+        <w:ind w:left="5760" w:hanging="360"/>
+      </w:pPr>
+      <w:rPr>
+        <w:u w:val="none"/>
+      </w:rPr>
+    </w:lvl>
+    <w:lvl w:ilvl="8">
+      <w:start w:val="1"/>
+      <w:numFmt w:val="bullet"/>
+      <w:lvlText w:val="■"/>
+      <w:lvlJc w:val="left"/>
+      <w:pPr>
+        <w:ind w:left="6480" w:hanging="360"/>
+      </w:pPr>
+      <w:rPr>
+        <w:u w:val="none"/>
+      </w:rPr>
+    </w:lvl>
+  </w:abstractNum>
+  <w:abstractNum w:abstractNumId="3">
+    <w:lvl w:ilvl="0">
+      <w:start w:val="1"/>
+      <w:numFmt w:val="bullet"/>
+      <w:lvlText w:val="●"/>
+      <w:lvlJc w:val="left"/>
+      <w:pPr>
+        <w:ind w:left="720" w:hanging="360"/>
+      </w:pPr>
+      <w:rPr>
+        <w:u w:val="none"/>
+      </w:rPr>
+    </w:lvl>
+    <w:lvl w:ilvl="1">
+      <w:start w:val="1"/>
+      <w:numFmt w:val="bullet"/>
+      <w:lvlText w:val="○"/>
+      <w:lvlJc w:val="left"/>
+      <w:pPr>
+        <w:ind w:left="1440" w:hanging="360"/>
+      </w:pPr>
+      <w:rPr>
+        <w:u w:val="none"/>
+      </w:rPr>
+    </w:lvl>
+    <w:lvl w:ilvl="2">
+      <w:start w:val="1"/>
+      <w:numFmt w:val="bullet"/>
+      <w:lvlText w:val="■"/>
+      <w:lvlJc w:val="left"/>
+      <w:pPr>
+        <w:ind w:left="2160" w:hanging="360"/>
+      </w:pPr>
+      <w:rPr>
+        <w:u w:val="none"/>
+      </w:rPr>
+    </w:lvl>
+    <w:lvl w:ilvl="3">
+      <w:start w:val="1"/>
+      <w:numFmt w:val="bullet"/>
+      <w:lvlText w:val="●"/>
+      <w:lvlJc w:val="left"/>
+      <w:pPr>
+        <w:ind w:left="2880" w:hanging="360"/>
+      </w:pPr>
+      <w:rPr>
+        <w:u w:val="none"/>
+      </w:rPr>
+    </w:lvl>
+    <w:lvl w:ilvl="4">
+      <w:start w:val="1"/>
+      <w:numFmt w:val="bullet"/>
+      <w:lvlText w:val="○"/>
+      <w:lvlJc w:val="left"/>
+      <w:pPr>
+        <w:ind w:left="3600" w:hanging="360"/>
+      </w:pPr>
+      <w:rPr>
+        <w:u w:val="none"/>
+      </w:rPr>
+    </w:lvl>
+    <w:lvl w:ilvl="5">
+      <w:start w:val="1"/>
+      <w:numFmt w:val="bullet"/>
+      <w:lvlText w:val="■"/>
+      <w:lvlJc w:val="left"/>
+      <w:pPr>
+        <w:ind w:left="4320" w:hanging="360"/>
+      </w:pPr>
+      <w:rPr>
+        <w:u w:val="none"/>
+      </w:rPr>
+    </w:lvl>
+    <w:lvl w:ilvl="6">
+      <w:start w:val="1"/>
+      <w:numFmt w:val="bullet"/>
+      <w:lvlText w:val="●"/>
+      <w:lvlJc w:val="left"/>
+      <w:pPr>
+        <w:ind w:left="5040" w:hanging="360"/>
+      </w:pPr>
+      <w:rPr>
+        <w:u w:val="none"/>
+      </w:rPr>
+    </w:lvl>
+    <w:lvl w:ilvl="7">
+      <w:start w:val="1"/>
+      <w:numFmt w:val="bullet"/>
+      <w:lvlText w:val="○"/>
+      <w:lvlJc w:val="left"/>
+      <w:pPr>
+        <w:ind w:left="5760" w:hanging="360"/>
+      </w:pPr>
+      <w:rPr>
+        <w:u w:val="none"/>
+      </w:rPr>
+    </w:lvl>
+    <w:lvl w:ilvl="8">
+      <w:start w:val="1"/>
+      <w:numFmt w:val="bullet"/>
+      <w:lvlText w:val="■"/>
+      <w:lvlJc w:val="left"/>
+      <w:pPr>
+        <w:ind w:left="6480" w:hanging="360"/>
+      </w:pPr>
+      <w:rPr>
+        <w:u w:val="none"/>
+      </w:rPr>
+    </w:lvl>
+  </w:abstractNum>
+  <w:abstractNum w:abstractNumId="4">
+    <w:lvl w:ilvl="0">
+      <w:start w:val="1"/>
+      <w:numFmt w:val="bullet"/>
+      <w:lvlText w:val="●"/>
+      <w:lvlJc w:val="left"/>
+      <w:pPr>
+        <w:ind w:left="720" w:hanging="360"/>
+      </w:pPr>
+      <w:rPr>
+        <w:u w:val="none"/>
+      </w:rPr>
+    </w:lvl>
+    <w:lvl w:ilvl="1">
+      <w:start w:val="1"/>
+      <w:numFmt w:val="bullet"/>
+      <w:lvlText w:val="○"/>
+      <w:lvlJc w:val="left"/>
+      <w:pPr>
+        <w:ind w:left="1440" w:hanging="360"/>
+      </w:pPr>
+      <w:rPr>
+        <w:u w:val="none"/>
+      </w:rPr>
+    </w:lvl>
+    <w:lvl w:ilvl="2">
+      <w:start w:val="1"/>
+      <w:numFmt w:val="bullet"/>
+      <w:lvlText w:val="■"/>
+      <w:lvlJc w:val="left"/>
+      <w:pPr>
+        <w:ind w:left="2160" w:hanging="360"/>
+      </w:pPr>
+      <w:rPr>
+        <w:u w:val="none"/>
+      </w:rPr>
+    </w:lvl>
+    <w:lvl w:ilvl="3">
+      <w:start w:val="1"/>
+      <w:numFmt w:val="bullet"/>
+      <w:lvlText w:val="●"/>
+      <w:lvlJc w:val="left"/>
+      <w:pPr>
+        <w:ind w:left="2880" w:hanging="360"/>
+      </w:pPr>
+      <w:rPr>
+        <w:u w:val="none"/>
+      </w:rPr>
+    </w:lvl>
+    <w:lvl w:ilvl="4">
+      <w:start w:val="1"/>
+      <w:numFmt w:val="bullet"/>
+      <w:lvlText w:val="○"/>
+      <w:lvlJc w:val="left"/>
+      <w:pPr>
+        <w:ind w:left="3600" w:hanging="360"/>
+      </w:pPr>
+      <w:rPr>
+        <w:u w:val="none"/>
+      </w:rPr>
+    </w:lvl>
+    <w:lvl w:ilvl="5">
+      <w:start w:val="1"/>
+      <w:numFmt w:val="bullet"/>
+      <w:lvlText w:val="■"/>
+      <w:lvlJc w:val="left"/>
+      <w:pPr>
+        <w:ind w:left="4320" w:hanging="360"/>
+      </w:pPr>
+      <w:rPr>
+        <w:u w:val="none"/>
+      </w:rPr>
+    </w:lvl>
+    <w:lvl w:ilvl="6">
+      <w:start w:val="1"/>
+      <w:numFmt w:val="bullet"/>
+      <w:lvlText w:val="●"/>
+      <w:lvlJc w:val="left"/>
+      <w:pPr>
+        <w:ind w:left="5040" w:hanging="360"/>
+      </w:pPr>
+      <w:rPr>
+        <w:u w:val="none"/>
+      </w:rPr>
+    </w:lvl>
+    <w:lvl w:ilvl="7">
+      <w:start w:val="1"/>
+      <w:numFmt w:val="bullet"/>
+      <w:lvlText w:val="○"/>
+      <w:lvlJc w:val="left"/>
+      <w:pPr>
+        <w:ind w:left="5760" w:hanging="360"/>
+      </w:pPr>
+      <w:rPr>
+        <w:u w:val="none"/>
+      </w:rPr>
+    </w:lvl>
+    <w:lvl w:ilvl="8">
+      <w:start w:val="1"/>
+      <w:numFmt w:val="bullet"/>
+      <w:lvlText w:val="■"/>
+      <w:lvlJc w:val="left"/>
+      <w:pPr>
+        <w:ind w:left="6480" w:hanging="360"/>
+      </w:pPr>
+      <w:rPr>
+        <w:u w:val="none"/>
+      </w:rPr>
+    </w:lvl>
+  </w:abstractNum>
+  <w:num w:numId="1">
+    <w:abstractNumId w:val="1"/>
+  </w:num>
+  <w:num w:numId="2">
+    <w:abstractNumId w:val="2"/>
+  </w:num>
+  <w:num w:numId="3">
+    <w:abstractNumId w:val="3"/>
+  </w:num>
+  <w:num w:numId="4">
+    <w:abstractNumId w:val="4"/>
+  </w:num>
+</w:numbering>
 </file>
 
 <file path=word/styles.xml><?xml version="1.0" encoding="utf-8"?>
@@ -8272,6 +9852,13 @@
     </w:tblPr>
   </w:style>
   <w:style w:type="table" w:styleId="Table3">
+    <w:basedOn w:val="TableNormal"/>
+    <w:tblPr>
+      <w:tblStyleRowBandSize w:val="1"/>
+      <w:tblStyleColBandSize w:val="1"/>
+    </w:tblPr>
+  </w:style>
+  <w:style w:type="table" w:styleId="Table4">
     <w:basedOn w:val="TableNormal"/>
     <w:tblPr>
       <w:tblStyleRowBandSize w:val="1"/>

</xml_diff>

<commit_message>
preenchimento da metade dos fluxos principais
</commit_message>
<xml_diff>
--- a/Sleep_street.docx
+++ b/Sleep_street.docx
@@ -6547,7 +6547,36 @@
                 <w:vertAlign w:val="baseline"/>
                 <w:rtl w:val="0"/>
               </w:rPr>
-              <w:t xml:space="preserve">Descrição:viajante informa os preços desejados de hospedagens e atrações. O app sugere opções mais baratas ou com melhor</w:t>
+              <w:t xml:space="preserve">Descrição:</w:t>
+            </w:r>
+            <w:r>
+              <w:rPr>
+                <w:b w:val="1"/>
+                <w:bCs w:val="1"/>
+                <w:sz w:val="24"/>
+                <w:szCs w:val="24"/>
+                <w:rtl w:val="0"/>
+              </w:rPr>
+              <w:t xml:space="preserve">O viajante</w:t>
+            </w:r>
+            <w:r>
+              <w:rPr>
+                <w:rFonts w:ascii="Arial" w:cs="Arial" w:eastAsia="Arial" w:hAnsi="Arial"/>
+                <w:b w:val="1"/>
+                <w:bCs w:val="1"/>
+                <w:i w:val="0"/>
+                <w:iCs w:val="0"/>
+                <w:smallCaps w:val="0"/>
+                <w:strike w:val="0"/>
+                <w:color w:val="000000"/>
+                <w:sz w:val="24"/>
+                <w:szCs w:val="24"/>
+                <w:u w:val="none"/>
+                <w:shd w:fill="auto" w:val="clear"/>
+                <w:vertAlign w:val="baseline"/>
+                <w:rtl w:val="0"/>
+              </w:rPr>
+              <w:t xml:space="preserve"> informa os preços desejados de hospedagens e atrações. O app sugere opções mais baratas ou com melhor</w:t>
             </w:r>
           </w:p>
         </w:tc>
@@ -8562,8 +8591,102 @@
           </w:tcPr>
           <w:p>
             <w:pPr>
-              <w:widowControl w:val="0"/>
-              <w:spacing w:line="240" w:lineRule="auto"/>
+              <w:numPr>
+                <w:ilvl w:val="0"/>
+                <w:numId w:val="4"/>
+              </w:numPr>
+              <w:ind w:left="720" w:hanging="360"/>
+              <w:rPr>
+                <w:sz w:val="24"/>
+                <w:szCs w:val="24"/>
+              </w:rPr>
+            </w:pPr>
+            <w:r>
+              <w:rPr>
+                <w:rtl w:val="0"/>
+              </w:rPr>
+              <w:t xml:space="preserve"> A conta é criada e ativada com sucesso.</w:t>
+            </w:r>
+          </w:p>
+          <w:p>
+            <w:pPr>
+              <w:numPr>
+                <w:ilvl w:val="0"/>
+                <w:numId w:val="4"/>
+              </w:numPr>
+              <w:ind w:left="720" w:hanging="360"/>
+              <w:rPr>
+                <w:sz w:val="24"/>
+                <w:szCs w:val="24"/>
+              </w:rPr>
+            </w:pPr>
+            <w:r>
+              <w:rPr>
+                <w:rtl w:val="0"/>
+              </w:rPr>
+              <w:t xml:space="preserve"> A viagem é criada, editada ou cancelada com sucesso.</w:t>
+            </w:r>
+          </w:p>
+          <w:p>
+            <w:pPr>
+              <w:numPr>
+                <w:ilvl w:val="0"/>
+                <w:numId w:val="4"/>
+              </w:numPr>
+              <w:ind w:left="720" w:hanging="360"/>
+              <w:rPr>
+                <w:sz w:val="24"/>
+                <w:szCs w:val="24"/>
+              </w:rPr>
+            </w:pPr>
+            <w:r>
+              <w:rPr>
+                <w:rtl w:val="0"/>
+              </w:rPr>
+              <w:t xml:space="preserve"> Os gastos são salvos com categoria e total calculado.</w:t>
+            </w:r>
+          </w:p>
+          <w:p>
+            <w:pPr>
+              <w:numPr>
+                <w:ilvl w:val="0"/>
+                <w:numId w:val="4"/>
+              </w:numPr>
+              <w:ind w:left="720" w:hanging="360"/>
+              <w:rPr>
+                <w:sz w:val="24"/>
+                <w:szCs w:val="24"/>
+              </w:rPr>
+            </w:pPr>
+            <w:r>
+              <w:rPr>
+                <w:rtl w:val="0"/>
+              </w:rPr>
+              <w:t xml:space="preserve"> O tipo de viagem é salvo e usado para gerar bagagem e sugestões.</w:t>
+            </w:r>
+          </w:p>
+          <w:p>
+            <w:pPr>
+              <w:numPr>
+                <w:ilvl w:val="0"/>
+                <w:numId w:val="4"/>
+              </w:numPr>
+              <w:ind w:left="720" w:hanging="360"/>
+              <w:rPr>
+                <w:sz w:val="24"/>
+                <w:szCs w:val="24"/>
+              </w:rPr>
+            </w:pPr>
+            <w:r>
+              <w:rPr>
+                <w:rtl w:val="0"/>
+              </w:rPr>
+              <w:t xml:space="preserve">As configurações de perfil (incluindo idade) são persistidas e acessíveis.</w:t>
+            </w:r>
+          </w:p>
+          <w:p>
+            <w:pPr>
+              <w:ind w:left="720" w:firstLine="0"/>
               <w:rPr>
                 <w:sz w:val="24"/>
                 <w:szCs w:val="24"/>
@@ -8629,6 +8752,105 @@
           </w:tcPr>
           <w:p>
             <w:pPr>
+              <w:rPr/>
+            </w:pPr>
+            <w:r>
+              <w:rPr>
+                <w:rtl w:val="0"/>
+              </w:rPr>
+              <w:t xml:space="preserve">1. O usuário preenche os dados de cadastro: nome completo, e-mail válido e senha forte.</w:t>
+            </w:r>
+          </w:p>
+          <w:p>
+            <w:pPr>
+              <w:rPr/>
+            </w:pPr>
+            <w:r>
+              <w:rPr>
+                <w:rtl w:val="0"/>
+              </w:rPr>
+              <w:t xml:space="preserve">2. O sistema realiza o registro e armazena o usuário no banco de dados.</w:t>
+            </w:r>
+          </w:p>
+          <w:p>
+            <w:pPr>
+              <w:rPr/>
+            </w:pPr>
+            <w:r>
+              <w:rPr>
+                <w:rtl w:val="0"/>
+              </w:rPr>
+              <w:t xml:space="preserve">3. O sistema valida a data de nascimento e verifica se o usuário tem 18 anos ou mais.</w:t>
+            </w:r>
+          </w:p>
+          <w:p>
+            <w:pPr>
+              <w:rPr/>
+            </w:pPr>
+            <w:r>
+              <w:rPr>
+                <w:rtl w:val="0"/>
+              </w:rPr>
+              <w:t xml:space="preserve">4. Se a idade for válida, exibe mensagem de sucesso e permite login direto.</w:t>
+            </w:r>
+          </w:p>
+          <w:p>
+            <w:pPr>
+              <w:rPr/>
+            </w:pPr>
+            <w:r>
+              <w:rPr>
+                <w:rtl w:val="0"/>
+              </w:rPr>
+              <w:t xml:space="preserve">5. Caso a idade seja inferior a 18 anos, exibe alerta e bloqueia o acesso à criação de viagens.</w:t>
+            </w:r>
+          </w:p>
+          <w:p>
+            <w:pPr>
+              <w:rPr/>
+            </w:pPr>
+            <w:r>
+              <w:rPr>
+                <w:rtl w:val="0"/>
+              </w:rPr>
+              <w:t xml:space="preserve">6. O usuário acessa a tela de "Minhas Viagens" e clica em "+" para criar uma nova viagem.</w:t>
+            </w:r>
+          </w:p>
+          <w:p>
+            <w:pPr>
+              <w:rPr/>
+            </w:pPr>
+            <w:r>
+              <w:rPr>
+                <w:rtl w:val="0"/>
+              </w:rPr>
+              <w:t xml:space="preserve">7. Preenche os dados obrigatórios (destino, datas, orçamento etc.).</w:t>
+            </w:r>
+          </w:p>
+          <w:p>
+            <w:pPr>
+              <w:rPr/>
+            </w:pPr>
+            <w:r>
+              <w:rPr>
+                <w:rtl w:val="0"/>
+              </w:rPr>
+              <w:t xml:space="preserve">8. Clica em "Salvar".</w:t>
+            </w:r>
+          </w:p>
+          <w:p>
+            <w:pPr>
+              <w:rPr/>
+            </w:pPr>
+            <w:r>
+              <w:rPr>
+                <w:rtl w:val="0"/>
+              </w:rPr>
+              <w:t xml:space="preserve">9. O sistema valida os dados e os salva no banco.</w:t>
+            </w:r>
+          </w:p>
+          <w:p>
+            <w:pPr>
               <w:widowControl w:val="0"/>
               <w:spacing w:line="240" w:lineRule="auto"/>
               <w:rPr>
@@ -8736,7 +8958,7 @@
               <w:widowControl w:val="0"/>
               <w:numPr>
                 <w:ilvl w:val="0"/>
-                <w:numId w:val="4"/>
+                <w:numId w:val="5"/>
               </w:numPr>
               <w:spacing w:line="240" w:lineRule="auto"/>
               <w:ind w:left="720" w:hanging="360"/>
@@ -8785,7 +9007,7 @@
               <w:widowControl w:val="0"/>
               <w:numPr>
                 <w:ilvl w:val="0"/>
-                <w:numId w:val="4"/>
+                <w:numId w:val="5"/>
               </w:numPr>
               <w:spacing w:line="240" w:lineRule="auto"/>
               <w:ind w:left="720" w:hanging="360"/>
@@ -8810,7 +9032,7 @@
                 <w:szCs w:val="24"/>
                 <w:rtl w:val="0"/>
               </w:rPr>
-              <w:t xml:space="preserve"> O sistema aplica isenção total de frete (R$ 0,00) ao carrinho. </w:t>
+              <w:t xml:space="preserve"> O sistema aplica isenção total de frete (R$0,00) ao carrinho. </w:t>
             </w:r>
           </w:p>
           <w:p>
@@ -9654,6 +9876,116 @@
       </w:rPr>
     </w:lvl>
   </w:abstractNum>
+  <w:abstractNum w:abstractNumId="5">
+    <w:lvl w:ilvl="0">
+      <w:start w:val="1"/>
+      <w:numFmt w:val="bullet"/>
+      <w:lvlText w:val="●"/>
+      <w:lvlJc w:val="left"/>
+      <w:pPr>
+        <w:ind w:left="720" w:hanging="360"/>
+      </w:pPr>
+      <w:rPr>
+        <w:u w:val="none"/>
+      </w:rPr>
+    </w:lvl>
+    <w:lvl w:ilvl="1">
+      <w:start w:val="1"/>
+      <w:numFmt w:val="bullet"/>
+      <w:lvlText w:val="○"/>
+      <w:lvlJc w:val="left"/>
+      <w:pPr>
+        <w:ind w:left="1440" w:hanging="360"/>
+      </w:pPr>
+      <w:rPr>
+        <w:u w:val="none"/>
+      </w:rPr>
+    </w:lvl>
+    <w:lvl w:ilvl="2">
+      <w:start w:val="1"/>
+      <w:numFmt w:val="bullet"/>
+      <w:lvlText w:val="■"/>
+      <w:lvlJc w:val="left"/>
+      <w:pPr>
+        <w:ind w:left="2160" w:hanging="360"/>
+      </w:pPr>
+      <w:rPr>
+        <w:u w:val="none"/>
+      </w:rPr>
+    </w:lvl>
+    <w:lvl w:ilvl="3">
+      <w:start w:val="1"/>
+      <w:numFmt w:val="bullet"/>
+      <w:lvlText w:val="●"/>
+      <w:lvlJc w:val="left"/>
+      <w:pPr>
+        <w:ind w:left="2880" w:hanging="360"/>
+      </w:pPr>
+      <w:rPr>
+        <w:u w:val="none"/>
+      </w:rPr>
+    </w:lvl>
+    <w:lvl w:ilvl="4">
+      <w:start w:val="1"/>
+      <w:numFmt w:val="bullet"/>
+      <w:lvlText w:val="○"/>
+      <w:lvlJc w:val="left"/>
+      <w:pPr>
+        <w:ind w:left="3600" w:hanging="360"/>
+      </w:pPr>
+      <w:rPr>
+        <w:u w:val="none"/>
+      </w:rPr>
+    </w:lvl>
+    <w:lvl w:ilvl="5">
+      <w:start w:val="1"/>
+      <w:numFmt w:val="bullet"/>
+      <w:lvlText w:val="■"/>
+      <w:lvlJc w:val="left"/>
+      <w:pPr>
+        <w:ind w:left="4320" w:hanging="360"/>
+      </w:pPr>
+      <w:rPr>
+        <w:u w:val="none"/>
+      </w:rPr>
+    </w:lvl>
+    <w:lvl w:ilvl="6">
+      <w:start w:val="1"/>
+      <w:numFmt w:val="bullet"/>
+      <w:lvlText w:val="●"/>
+      <w:lvlJc w:val="left"/>
+      <w:pPr>
+        <w:ind w:left="5040" w:hanging="360"/>
+      </w:pPr>
+      <w:rPr>
+        <w:u w:val="none"/>
+      </w:rPr>
+    </w:lvl>
+    <w:lvl w:ilvl="7">
+      <w:start w:val="1"/>
+      <w:numFmt w:val="bullet"/>
+      <w:lvlText w:val="○"/>
+      <w:lvlJc w:val="left"/>
+      <w:pPr>
+        <w:ind w:left="5760" w:hanging="360"/>
+      </w:pPr>
+      <w:rPr>
+        <w:u w:val="none"/>
+      </w:rPr>
+    </w:lvl>
+    <w:lvl w:ilvl="8">
+      <w:start w:val="1"/>
+      <w:numFmt w:val="bullet"/>
+      <w:lvlText w:val="■"/>
+      <w:lvlJc w:val="left"/>
+      <w:pPr>
+        <w:ind w:left="6480" w:hanging="360"/>
+      </w:pPr>
+      <w:rPr>
+        <w:u w:val="none"/>
+      </w:rPr>
+    </w:lvl>
+  </w:abstractNum>
   <w:num w:numId="1">
     <w:abstractNumId w:val="1"/>
   </w:num>
@@ -9665,6 +9997,9 @@
   </w:num>
   <w:num w:numId="4">
     <w:abstractNumId w:val="4"/>
+  </w:num>
+  <w:num w:numId="5">
+    <w:abstractNumId w:val="5"/>
   </w:num>
 </w:numbering>
 </file>

</xml_diff>